<commit_message>
Điều chỉnh báo cáo
</commit_message>
<xml_diff>
--- a/Nhom5 (1).docx
+++ b/Nhom5 (1).docx
@@ -749,17 +749,102 @@
           <w:bCs/>
         </w:rPr>
         <w:lastRenderedPageBreak/>
-        <w:t>BẢNG PHÂN CÔNG CÔNG VIỆC</w:t>
-      </w:r>
-    </w:p>
-    <w:p>
-      <w:pPr>
+        <w:t>LỜI CẢM ƠN</w:t>
+      </w:r>
+    </w:p>
+    <w:p>
+      <w:r>
+        <w:t>Chúng em xin gửi lời tri ân sâu sắc đến PGS.TS. Hoàng Văn Dũng, giảng viên hướng dẫn môn học Xử lý ảnh số.</w:t>
+      </w:r>
+      <w:r>
+        <w:t xml:space="preserve"> Thầy không chỉ là người truyền đạt những kiến thức nền tảng quý báu về thị giác máy tính và xử lý ảnh, mà còn tận tình hướng dẫn, định hướng và đưa ra những lời khuyên sát sao giúp nhóm vượt qua nhiều khó khăn trong quá trình nghiên cứu và xây dựng</w:t>
+      </w:r>
+      <w:r>
+        <w:t xml:space="preserve"> đề tài</w:t>
+      </w:r>
+      <w:r>
+        <w:t>. Những góp ý của Thầy là tiền đề quan trọng giúp đề tài của nhóm hoàn thiện cả về mặt lý thuyết lẫn ứng dụng thực tiễn.</w:t>
+      </w:r>
+    </w:p>
+    <w:p>
+      <w:r>
+        <w:t>Dù đã nỗ lực hết sức để hoàn thiện đề tài, tuy nhiên do giới hạn về thời gian và kiến thức thực tế, báo cáo và sản phẩm chắc chắn không tránh khỏi những thiếu sót. Chúng em rất mong nhận được sự thông cảm cũng như những ý kiến đóng góp quý báu từ Thầy để hệ thống có thể được phát triển hoàn thiện hơn trong tương lai.</w:t>
+      </w:r>
+    </w:p>
+    <w:p>
+      <w:r>
+        <w:t>Một lần nữa, chúng em xin chân thành cảm ơn!</w:t>
+      </w:r>
+    </w:p>
+    <w:p>
+      <w:pPr>
+        <w:spacing w:before="0" w:after="160" w:line="259" w:lineRule="auto"/>
+        <w:ind w:firstLine="0"/>
         <w:jc w:val="center"/>
         <w:rPr>
           <w:b/>
           <w:bCs/>
         </w:rPr>
       </w:pPr>
+    </w:p>
+    <w:p>
+      <w:pPr>
+        <w:spacing w:before="0" w:after="160" w:line="259" w:lineRule="auto"/>
+        <w:ind w:firstLine="0"/>
+        <w:jc w:val="left"/>
+        <w:rPr>
+          <w:b/>
+          <w:bCs/>
+        </w:rPr>
+      </w:pPr>
+      <w:r>
+        <w:rPr>
+          <w:b/>
+          <w:bCs/>
+        </w:rPr>
+        <w:br w:type="page"/>
+      </w:r>
+    </w:p>
+    <w:p>
+      <w:pPr>
+        <w:spacing w:before="0" w:after="160" w:line="259" w:lineRule="auto"/>
+        <w:ind w:firstLine="0"/>
+        <w:jc w:val="center"/>
+        <w:rPr>
+          <w:b/>
+          <w:bCs/>
+        </w:rPr>
+      </w:pPr>
+      <w:r>
+        <w:rPr>
+          <w:b/>
+          <w:bCs/>
+        </w:rPr>
+        <w:t>BẢNG PHÂN CÔNG CÔNG VIỆC</w:t>
+      </w:r>
+    </w:p>
+    <w:p>
+      <w:r>
+        <w:t xml:space="preserve">Dự án được thực hiện </w:t>
+      </w:r>
+      <w:r>
+        <w:t>bởi Nhóm 05</w:t>
+      </w:r>
+      <w:r>
+        <w:t xml:space="preserve"> (Lớp học phần: </w:t>
+      </w:r>
+      <w:r>
+        <w:t>“DIPR430685_06CLC</w:t>
+      </w:r>
+      <w:r>
+        <w:t>”</w:t>
+      </w:r>
+      <w:r>
+        <w:t>),</w:t>
+      </w:r>
+      <w:r>
+        <w:t xml:space="preserve"> với sự đóng góp công sức và tinh thần làm việc nhóm cao độ từ tất cả các thành viên. Bảng dưới đây tóm tắt các hạng mục công việc chính và vai trò của từng thành viên:</w:t>
+      </w:r>
     </w:p>
     <w:tbl>
       <w:tblPr>
@@ -768,15 +853,15 @@
         <w:tblLook w:val="04A0" w:firstRow="1" w:lastRow="0" w:firstColumn="1" w:lastColumn="0" w:noHBand="0" w:noVBand="1"/>
       </w:tblPr>
       <w:tblGrid>
-        <w:gridCol w:w="2322"/>
-        <w:gridCol w:w="2322"/>
-        <w:gridCol w:w="2322"/>
-        <w:gridCol w:w="2322"/>
+        <w:gridCol w:w="1526"/>
+        <w:gridCol w:w="2410"/>
+        <w:gridCol w:w="4394"/>
+        <w:gridCol w:w="958"/>
       </w:tblGrid>
       <w:tr>
         <w:tc>
           <w:tcPr>
-            <w:tcW w:w="2322" w:type="dxa"/>
+            <w:tcW w:w="1526" w:type="dxa"/>
           </w:tcPr>
           <w:p>
             <w:pPr>
@@ -797,7 +882,7 @@
         </w:tc>
         <w:tc>
           <w:tcPr>
-            <w:tcW w:w="2322" w:type="dxa"/>
+            <w:tcW w:w="2410" w:type="dxa"/>
           </w:tcPr>
           <w:p>
             <w:pPr>
@@ -818,7 +903,7 @@
         </w:tc>
         <w:tc>
           <w:tcPr>
-            <w:tcW w:w="2322" w:type="dxa"/>
+            <w:tcW w:w="4394" w:type="dxa"/>
           </w:tcPr>
           <w:p>
             <w:pPr>
@@ -839,7 +924,7 @@
         </w:tc>
         <w:tc>
           <w:tcPr>
-            <w:tcW w:w="2322" w:type="dxa"/>
+            <w:tcW w:w="958" w:type="dxa"/>
           </w:tcPr>
           <w:p>
             <w:pPr>
@@ -862,7 +947,7 @@
       <w:tr>
         <w:tc>
           <w:tcPr>
-            <w:tcW w:w="2322" w:type="dxa"/>
+            <w:tcW w:w="1526" w:type="dxa"/>
           </w:tcPr>
           <w:p>
             <w:pPr>
@@ -875,7 +960,7 @@
         </w:tc>
         <w:tc>
           <w:tcPr>
-            <w:tcW w:w="2322" w:type="dxa"/>
+            <w:tcW w:w="2410" w:type="dxa"/>
           </w:tcPr>
           <w:p>
             <w:pPr>
@@ -888,29 +973,51 @@
         </w:tc>
         <w:tc>
           <w:tcPr>
-            <w:tcW w:w="2322" w:type="dxa"/>
+            <w:tcW w:w="4394" w:type="dxa"/>
           </w:tcPr>
           <w:p>
             <w:pPr>
               <w:pStyle w:val="Normal2"/>
             </w:pPr>
             <w:r>
-              <w:t xml:space="preserve">Xây dựng module </w:t>
-            </w:r>
-            <w:r>
-              <w:t xml:space="preserve">thu nhận và </w:t>
-            </w:r>
-            <w:r>
-              <w:t xml:space="preserve">tiền xử lý </w:t>
-            </w:r>
-            <w:r>
-              <w:t>video</w:t>
-            </w:r>
-          </w:p>
-        </w:tc>
-        <w:tc>
-          <w:tcPr>
-            <w:tcW w:w="2322" w:type="dxa"/>
+              <w:t xml:space="preserve">- </w:t>
+            </w:r>
+            <w:r>
+              <w:t>Nghiên cứu và cài đặt module Tiền xử lý ảnh số thích ứng (Adaptive DIP Enhancement).</w:t>
+            </w:r>
+          </w:p>
+          <w:p>
+            <w:pPr>
+              <w:pStyle w:val="Normal2"/>
+              <w:rPr>
+                <w:rStyle w:val="Normal2Char"/>
+              </w:rPr>
+            </w:pPr>
+            <w:r>
+              <w:rPr>
+                <w:rStyle w:val="Normal2Char"/>
+              </w:rPr>
+              <w:t>- Phát triển chức năng Auto-Calibration (tự động điều chỉnh độ sáng, nhiễu, độ tương phản).</w:t>
+            </w:r>
+          </w:p>
+          <w:p>
+            <w:pPr>
+              <w:pStyle w:val="Normal2"/>
+            </w:pPr>
+            <w:r>
+              <w:rPr>
+                <w:rStyle w:val="Normal2Char"/>
+              </w:rPr>
+              <w:t xml:space="preserve">- </w:t>
+            </w:r>
+            <w:r>
+              <w:t>Đảm bảo chất lượng khung hình đầu vào trước khi đưa qua mô hình AI.</w:t>
+            </w:r>
+          </w:p>
+        </w:tc>
+        <w:tc>
+          <w:tcPr>
+            <w:tcW w:w="958" w:type="dxa"/>
           </w:tcPr>
           <w:p>
             <w:pPr>
@@ -925,7 +1032,7 @@
       <w:tr>
         <w:tc>
           <w:tcPr>
-            <w:tcW w:w="2322" w:type="dxa"/>
+            <w:tcW w:w="1526" w:type="dxa"/>
           </w:tcPr>
           <w:p>
             <w:pPr>
@@ -938,7 +1045,7 @@
         </w:tc>
         <w:tc>
           <w:tcPr>
-            <w:tcW w:w="2322" w:type="dxa"/>
+            <w:tcW w:w="2410" w:type="dxa"/>
           </w:tcPr>
           <w:p>
             <w:pPr>
@@ -951,23 +1058,48 @@
         </w:tc>
         <w:tc>
           <w:tcPr>
-            <w:tcW w:w="2322" w:type="dxa"/>
+            <w:tcW w:w="4394" w:type="dxa"/>
           </w:tcPr>
           <w:p>
             <w:pPr>
               <w:pStyle w:val="Normal2"/>
             </w:pPr>
             <w:r>
-              <w:t>Xây dựng GUI, module nhận dạng và theo dõi đối tượng</w:t>
-            </w:r>
-            <w:r>
-              <w:t>, quy tắc Heuristic</w:t>
-            </w:r>
-          </w:p>
-        </w:tc>
-        <w:tc>
-          <w:tcPr>
-            <w:tcW w:w="2322" w:type="dxa"/>
+              <w:t xml:space="preserve">- </w:t>
+            </w:r>
+            <w:r>
+              <w:t>Thiết kế kiến trúc tổng thể và xây dựng hệ thống phần mềm (CustomTkinter UI).</w:t>
+            </w:r>
+          </w:p>
+          <w:p>
+            <w:pPr>
+              <w:pStyle w:val="Normal2"/>
+            </w:pPr>
+            <w:r>
+              <w:rPr>
+                <w:lang w:val="en-US"/>
+              </w:rPr>
+              <w:t xml:space="preserve">- </w:t>
+            </w:r>
+            <w:r>
+              <w:t>Quản lý luồng Camera/Video, tích hợp YOLO11-Pose và hệ thống cảnh báo (Telegram, Lịch sử)</w:t>
+            </w:r>
+          </w:p>
+          <w:p>
+            <w:pPr>
+              <w:pStyle w:val="Normal2"/>
+            </w:pPr>
+            <w:r>
+              <w:t xml:space="preserve">- </w:t>
+            </w:r>
+            <w:r>
+              <w:t>Thu thập, xử lý dữ liệu và ráp nối toàn bộ luồng suy luận (Inference Pipeline)</w:t>
+            </w:r>
+          </w:p>
+        </w:tc>
+        <w:tc>
+          <w:tcPr>
+            <w:tcW w:w="958" w:type="dxa"/>
           </w:tcPr>
           <w:p>
             <w:pPr>
@@ -982,7 +1114,7 @@
       <w:tr>
         <w:tc>
           <w:tcPr>
-            <w:tcW w:w="2322" w:type="dxa"/>
+            <w:tcW w:w="1526" w:type="dxa"/>
           </w:tcPr>
           <w:p>
             <w:pPr>
@@ -995,36 +1127,64 @@
         </w:tc>
         <w:tc>
           <w:tcPr>
-            <w:tcW w:w="2322" w:type="dxa"/>
+            <w:tcW w:w="2410" w:type="dxa"/>
           </w:tcPr>
           <w:p>
             <w:pPr>
               <w:pStyle w:val="Normal2"/>
-            </w:pPr>
-            <w:r>
+              <w:rPr>
+                <w:lang w:val="en-US"/>
+              </w:rPr>
+            </w:pPr>
+            <w:r>
+              <w:rPr>
+                <w:lang w:val="en-US"/>
+              </w:rPr>
               <w:t>Lương Nguyễn Thành Hưng</w:t>
             </w:r>
           </w:p>
         </w:tc>
         <w:tc>
           <w:tcPr>
-            <w:tcW w:w="2322" w:type="dxa"/>
+            <w:tcW w:w="4394" w:type="dxa"/>
           </w:tcPr>
           <w:p>
             <w:pPr>
               <w:pStyle w:val="Normal2"/>
             </w:pPr>
             <w:r>
-              <w:t xml:space="preserve">Xây dựng mạng </w:t>
-            </w:r>
-            <w:r>
-              <w:t>PoseBiGRU-Attention</w:t>
-            </w:r>
-          </w:p>
-        </w:tc>
-        <w:tc>
-          <w:tcPr>
-            <w:tcW w:w="2322" w:type="dxa"/>
+              <w:t xml:space="preserve">- </w:t>
+            </w:r>
+            <w:r>
+              <w:t>Nghiên cứu chuyên sâu về kiến trúc mạng hồi quy không gian thời gian.</w:t>
+            </w:r>
+          </w:p>
+          <w:p>
+            <w:pPr>
+              <w:pStyle w:val="Normal2"/>
+            </w:pPr>
+            <w:r>
+              <w:t>- Xây dựng, huấn luyện và đánh giá mạng học sâu PoseBiGRU.</w:t>
+            </w:r>
+          </w:p>
+          <w:p>
+            <w:pPr>
+              <w:pStyle w:val="Normal2"/>
+            </w:pPr>
+            <w:r>
+              <w:rPr>
+                <w:lang w:val="en-US"/>
+              </w:rPr>
+              <w:t xml:space="preserve">- </w:t>
+            </w:r>
+            <w:r>
+              <w:t>Tối ưu hóa siêu tham số và trích xuất đặc trưng hình học từ dữ liệu khung xương.</w:t>
+            </w:r>
+          </w:p>
+        </w:tc>
+        <w:tc>
+          <w:tcPr>
+            <w:tcW w:w="958" w:type="dxa"/>
           </w:tcPr>
           <w:p>
             <w:pPr>
@@ -1087,23 +1247,26 @@
       </w:pPr>
       <w:r>
         <w:rPr>
+          <w:b w:val="0"/>
           <w:lang w:val="pt-BR"/>
         </w:rPr>
         <w:fldChar w:fldCharType="begin"/>
       </w:r>
       <w:r>
         <w:rPr>
+          <w:b w:val="0"/>
           <w:lang w:val="pt-BR"/>
         </w:rPr>
         <w:instrText xml:space="preserve"> TOC \o "1-3" \h \z \u </w:instrText>
       </w:r>
       <w:r>
         <w:rPr>
+          <w:b w:val="0"/>
           <w:lang w:val="pt-BR"/>
         </w:rPr>
         <w:fldChar w:fldCharType="separate"/>
       </w:r>
-      <w:hyperlink w:anchor="_Toc232399518" w:history="1">
+      <w:hyperlink w:anchor="_Toc232570732" w:history="1">
         <w:r>
           <w:rPr>
             <w:rStyle w:val="Hyperlink"/>
@@ -1111,54 +1274,6 @@
             <w:lang w:val="pt-BR"/>
           </w:rPr>
           <w:t>DANH MỤC HÌNH ẢNH</w:t>
-        </w:r>
-        <w:r>
-          <w:rPr>
-            <w:noProof/>
-            <w:webHidden/>
-          </w:rPr>
-          <w:tab/>
-        </w:r>
-        <w:r>
-          <w:rPr>
-            <w:noProof/>
-            <w:webHidden/>
-          </w:rPr>
-          <w:fldChar w:fldCharType="begin"/>
-        </w:r>
-        <w:r>
-          <w:rPr>
-            <w:noProof/>
-            <w:webHidden/>
-          </w:rPr>
-          <w:instrText xml:space="preserve"> PAGEREF _Toc232399518 \h </w:instrText>
-        </w:r>
-        <w:r>
-          <w:rPr>
-            <w:noProof/>
-            <w:webHidden/>
-          </w:rPr>
-        </w:r>
-        <w:r>
-          <w:rPr>
-            <w:noProof/>
-            <w:webHidden/>
-          </w:rPr>
-          <w:fldChar w:fldCharType="separate"/>
-        </w:r>
-        <w:r>
-          <w:rPr>
-            <w:noProof/>
-            <w:webHidden/>
-          </w:rPr>
-          <w:t>5</w:t>
-        </w:r>
-        <w:r>
-          <w:rPr>
-            <w:noProof/>
-            <w:webHidden/>
-          </w:rPr>
-          <w:fldChar w:fldCharType="end"/>
         </w:r>
       </w:hyperlink>
     </w:p>
@@ -1177,7 +1292,7 @@
           <w:szCs w:val="22"/>
         </w:rPr>
       </w:pPr>
-      <w:hyperlink w:anchor="_Toc232399519" w:history="1">
+      <w:hyperlink w:anchor="_Toc232570733" w:history="1">
         <w:r>
           <w:rPr>
             <w:rStyle w:val="Hyperlink"/>
@@ -1204,7 +1319,7 @@
             <w:noProof/>
             <w:webHidden/>
           </w:rPr>
-          <w:instrText xml:space="preserve"> PAGEREF _Toc232399519 \h </w:instrText>
+          <w:instrText xml:space="preserve"> PAGEREF _Toc232570733 \h </w:instrText>
         </w:r>
         <w:r>
           <w:rPr>
@@ -1250,7 +1365,7 @@
           <w:szCs w:val="22"/>
         </w:rPr>
       </w:pPr>
-      <w:hyperlink w:anchor="_Toc232399520" w:history="1">
+      <w:hyperlink w:anchor="_Toc232570734" w:history="1">
         <w:r>
           <w:rPr>
             <w:rStyle w:val="Hyperlink"/>
@@ -1277,7 +1392,7 @@
             <w:noProof/>
             <w:webHidden/>
           </w:rPr>
-          <w:instrText xml:space="preserve"> PAGEREF _Toc232399520 \h </w:instrText>
+          <w:instrText xml:space="preserve"> PAGEREF _Toc232570734 \h </w:instrText>
         </w:r>
         <w:r>
           <w:rPr>
@@ -1323,7 +1438,7 @@
           <w:szCs w:val="22"/>
         </w:rPr>
       </w:pPr>
-      <w:hyperlink w:anchor="_Toc232399521" w:history="1">
+      <w:hyperlink w:anchor="_Toc232570735" w:history="1">
         <w:r>
           <w:rPr>
             <w:rStyle w:val="Hyperlink"/>
@@ -1350,7 +1465,7 @@
             <w:noProof/>
             <w:webHidden/>
           </w:rPr>
-          <w:instrText xml:space="preserve"> PAGEREF _Toc232399521 \h </w:instrText>
+          <w:instrText xml:space="preserve"> PAGEREF _Toc232570735 \h </w:instrText>
         </w:r>
         <w:r>
           <w:rPr>
@@ -1396,7 +1511,7 @@
           <w:szCs w:val="22"/>
         </w:rPr>
       </w:pPr>
-      <w:hyperlink w:anchor="_Toc232399522" w:history="1">
+      <w:hyperlink w:anchor="_Toc232570736" w:history="1">
         <w:r>
           <w:rPr>
             <w:rStyle w:val="Hyperlink"/>
@@ -1423,7 +1538,7 @@
             <w:noProof/>
             <w:webHidden/>
           </w:rPr>
-          <w:instrText xml:space="preserve"> PAGEREF _Toc232399522 \h </w:instrText>
+          <w:instrText xml:space="preserve"> PAGEREF _Toc232570736 \h </w:instrText>
         </w:r>
         <w:r>
           <w:rPr>
@@ -1468,7 +1583,7 @@
           <w:szCs w:val="22"/>
         </w:rPr>
       </w:pPr>
-      <w:hyperlink w:anchor="_Toc232399523" w:history="1">
+      <w:hyperlink w:anchor="_Toc232570737" w:history="1">
         <w:r>
           <w:rPr>
             <w:rStyle w:val="Hyperlink"/>
@@ -1495,7 +1610,7 @@
             <w:noProof/>
             <w:webHidden/>
           </w:rPr>
-          <w:instrText xml:space="preserve"> PAGEREF _Toc232399523 \h </w:instrText>
+          <w:instrText xml:space="preserve"> PAGEREF _Toc232570737 \h </w:instrText>
         </w:r>
         <w:r>
           <w:rPr>
@@ -1540,7 +1655,7 @@
           <w:szCs w:val="22"/>
         </w:rPr>
       </w:pPr>
-      <w:hyperlink w:anchor="_Toc232399524" w:history="1">
+      <w:hyperlink w:anchor="_Toc232570738" w:history="1">
         <w:r>
           <w:rPr>
             <w:rStyle w:val="Hyperlink"/>
@@ -1567,7 +1682,7 @@
             <w:noProof/>
             <w:webHidden/>
           </w:rPr>
-          <w:instrText xml:space="preserve"> PAGEREF _Toc232399524 \h </w:instrText>
+          <w:instrText xml:space="preserve"> PAGEREF _Toc232570738 \h </w:instrText>
         </w:r>
         <w:r>
           <w:rPr>
@@ -1613,7 +1728,7 @@
           <w:szCs w:val="22"/>
         </w:rPr>
       </w:pPr>
-      <w:hyperlink w:anchor="_Toc232399525" w:history="1">
+      <w:hyperlink w:anchor="_Toc232570739" w:history="1">
         <w:r>
           <w:rPr>
             <w:rStyle w:val="Hyperlink"/>
@@ -1640,7 +1755,7 @@
             <w:noProof/>
             <w:webHidden/>
           </w:rPr>
-          <w:instrText xml:space="preserve"> PAGEREF _Toc232399525 \h </w:instrText>
+          <w:instrText xml:space="preserve"> PAGEREF _Toc232570739 \h </w:instrText>
         </w:r>
         <w:r>
           <w:rPr>
@@ -1686,7 +1801,7 @@
           <w:szCs w:val="22"/>
         </w:rPr>
       </w:pPr>
-      <w:hyperlink w:anchor="_Toc232399526" w:history="1">
+      <w:hyperlink w:anchor="_Toc232570740" w:history="1">
         <w:r>
           <w:rPr>
             <w:rStyle w:val="Hyperlink"/>
@@ -1713,7 +1828,7 @@
             <w:noProof/>
             <w:webHidden/>
           </w:rPr>
-          <w:instrText xml:space="preserve"> PAGEREF _Toc232399526 \h </w:instrText>
+          <w:instrText xml:space="preserve"> PAGEREF _Toc232570740 \h </w:instrText>
         </w:r>
         <w:r>
           <w:rPr>
@@ -1758,7 +1873,7 @@
           <w:szCs w:val="22"/>
         </w:rPr>
       </w:pPr>
-      <w:hyperlink w:anchor="_Toc232399527" w:history="1">
+      <w:hyperlink w:anchor="_Toc232570741" w:history="1">
         <w:r>
           <w:rPr>
             <w:rStyle w:val="Hyperlink"/>
@@ -1785,7 +1900,7 @@
             <w:noProof/>
             <w:webHidden/>
           </w:rPr>
-          <w:instrText xml:space="preserve"> PAGEREF _Toc232399527 \h </w:instrText>
+          <w:instrText xml:space="preserve"> PAGEREF _Toc232570741 \h </w:instrText>
         </w:r>
         <w:r>
           <w:rPr>
@@ -1830,7 +1945,7 @@
           <w:szCs w:val="22"/>
         </w:rPr>
       </w:pPr>
-      <w:hyperlink w:anchor="_Toc232399528" w:history="1">
+      <w:hyperlink w:anchor="_Toc232570742" w:history="1">
         <w:r>
           <w:rPr>
             <w:rStyle w:val="Hyperlink"/>
@@ -1857,7 +1972,7 @@
             <w:noProof/>
             <w:webHidden/>
           </w:rPr>
-          <w:instrText xml:space="preserve"> PAGEREF _Toc232399528 \h </w:instrText>
+          <w:instrText xml:space="preserve"> PAGEREF _Toc232570742 \h </w:instrText>
         </w:r>
         <w:r>
           <w:rPr>
@@ -1903,7 +2018,7 @@
           <w:szCs w:val="22"/>
         </w:rPr>
       </w:pPr>
-      <w:hyperlink w:anchor="_Toc232399529" w:history="1">
+      <w:hyperlink w:anchor="_Toc232570743" w:history="1">
         <w:r>
           <w:rPr>
             <w:rStyle w:val="Hyperlink"/>
@@ -1930,7 +2045,7 @@
             <w:noProof/>
             <w:webHidden/>
           </w:rPr>
-          <w:instrText xml:space="preserve"> PAGEREF _Toc232399529 \h </w:instrText>
+          <w:instrText xml:space="preserve"> PAGEREF _Toc232570743 \h </w:instrText>
         </w:r>
         <w:r>
           <w:rPr>
@@ -1975,7 +2090,7 @@
           <w:szCs w:val="22"/>
         </w:rPr>
       </w:pPr>
-      <w:hyperlink w:anchor="_Toc232399530" w:history="1">
+      <w:hyperlink w:anchor="_Toc232570744" w:history="1">
         <w:r>
           <w:rPr>
             <w:rStyle w:val="Hyperlink"/>
@@ -2002,7 +2117,7 @@
             <w:noProof/>
             <w:webHidden/>
           </w:rPr>
-          <w:instrText xml:space="preserve"> PAGEREF _Toc232399530 \h </w:instrText>
+          <w:instrText xml:space="preserve"> PAGEREF _Toc232570744 \h </w:instrText>
         </w:r>
         <w:r>
           <w:rPr>
@@ -2047,7 +2162,7 @@
           <w:szCs w:val="22"/>
         </w:rPr>
       </w:pPr>
-      <w:hyperlink w:anchor="_Toc232399531" w:history="1">
+      <w:hyperlink w:anchor="_Toc232570745" w:history="1">
         <w:r>
           <w:rPr>
             <w:rStyle w:val="Hyperlink"/>
@@ -2074,7 +2189,7 @@
             <w:noProof/>
             <w:webHidden/>
           </w:rPr>
-          <w:instrText xml:space="preserve"> PAGEREF _Toc232399531 \h </w:instrText>
+          <w:instrText xml:space="preserve"> PAGEREF _Toc232570745 \h </w:instrText>
         </w:r>
         <w:r>
           <w:rPr>
@@ -2120,7 +2235,7 @@
           <w:szCs w:val="22"/>
         </w:rPr>
       </w:pPr>
-      <w:hyperlink w:anchor="_Toc232399532" w:history="1">
+      <w:hyperlink w:anchor="_Toc232570746" w:history="1">
         <w:r>
           <w:rPr>
             <w:rStyle w:val="Hyperlink"/>
@@ -2147,7 +2262,7 @@
             <w:noProof/>
             <w:webHidden/>
           </w:rPr>
-          <w:instrText xml:space="preserve"> PAGEREF _Toc232399532 \h </w:instrText>
+          <w:instrText xml:space="preserve"> PAGEREF _Toc232570746 \h </w:instrText>
         </w:r>
         <w:r>
           <w:rPr>
@@ -2192,7 +2307,7 @@
           <w:szCs w:val="22"/>
         </w:rPr>
       </w:pPr>
-      <w:hyperlink w:anchor="_Toc232399533" w:history="1">
+      <w:hyperlink w:anchor="_Toc232570747" w:history="1">
         <w:r>
           <w:rPr>
             <w:rStyle w:val="Hyperlink"/>
@@ -2219,7 +2334,7 @@
             <w:noProof/>
             <w:webHidden/>
           </w:rPr>
-          <w:instrText xml:space="preserve"> PAGEREF _Toc232399533 \h </w:instrText>
+          <w:instrText xml:space="preserve"> PAGEREF _Toc232570747 \h </w:instrText>
         </w:r>
         <w:r>
           <w:rPr>
@@ -2264,7 +2379,7 @@
           <w:szCs w:val="22"/>
         </w:rPr>
       </w:pPr>
-      <w:hyperlink w:anchor="_Toc232399534" w:history="1">
+      <w:hyperlink w:anchor="_Toc232570748" w:history="1">
         <w:r>
           <w:rPr>
             <w:rStyle w:val="Hyperlink"/>
@@ -2291,7 +2406,7 @@
             <w:noProof/>
             <w:webHidden/>
           </w:rPr>
-          <w:instrText xml:space="preserve"> PAGEREF _Toc232399534 \h </w:instrText>
+          <w:instrText xml:space="preserve"> PAGEREF _Toc232570748 \h </w:instrText>
         </w:r>
         <w:r>
           <w:rPr>
@@ -2337,7 +2452,7 @@
           <w:szCs w:val="22"/>
         </w:rPr>
       </w:pPr>
-      <w:hyperlink w:anchor="_Toc232399535" w:history="1">
+      <w:hyperlink w:anchor="_Toc232570749" w:history="1">
         <w:r>
           <w:rPr>
             <w:rStyle w:val="Hyperlink"/>
@@ -2364,7 +2479,7 @@
             <w:noProof/>
             <w:webHidden/>
           </w:rPr>
-          <w:instrText xml:space="preserve"> PAGEREF _Toc232399535 \h </w:instrText>
+          <w:instrText xml:space="preserve"> PAGEREF _Toc232570749 \h </w:instrText>
         </w:r>
         <w:r>
           <w:rPr>
@@ -2410,7 +2525,7 @@
           <w:szCs w:val="22"/>
         </w:rPr>
       </w:pPr>
-      <w:hyperlink w:anchor="_Toc232399536" w:history="1">
+      <w:hyperlink w:anchor="_Toc232570750" w:history="1">
         <w:r>
           <w:rPr>
             <w:rStyle w:val="Hyperlink"/>
@@ -2437,7 +2552,7 @@
             <w:noProof/>
             <w:webHidden/>
           </w:rPr>
-          <w:instrText xml:space="preserve"> PAGEREF _Toc232399536 \h </w:instrText>
+          <w:instrText xml:space="preserve"> PAGEREF _Toc232570750 \h </w:instrText>
         </w:r>
         <w:r>
           <w:rPr>
@@ -2483,7 +2598,7 @@
           <w:szCs w:val="22"/>
         </w:rPr>
       </w:pPr>
-      <w:hyperlink w:anchor="_Toc232399537" w:history="1">
+      <w:hyperlink w:anchor="_Toc232570751" w:history="1">
         <w:r>
           <w:rPr>
             <w:rStyle w:val="Hyperlink"/>
@@ -2510,7 +2625,7 @@
             <w:noProof/>
             <w:webHidden/>
           </w:rPr>
-          <w:instrText xml:space="preserve"> PAGEREF _Toc232399537 \h </w:instrText>
+          <w:instrText xml:space="preserve"> PAGEREF _Toc232570751 \h </w:instrText>
         </w:r>
         <w:r>
           <w:rPr>
@@ -2556,7 +2671,7 @@
           <w:szCs w:val="22"/>
         </w:rPr>
       </w:pPr>
-      <w:hyperlink w:anchor="_Toc232399538" w:history="1">
+      <w:hyperlink w:anchor="_Toc232570752" w:history="1">
         <w:r>
           <w:rPr>
             <w:rStyle w:val="Hyperlink"/>
@@ -2583,7 +2698,7 @@
             <w:noProof/>
             <w:webHidden/>
           </w:rPr>
-          <w:instrText xml:space="preserve"> PAGEREF _Toc232399538 \h </w:instrText>
+          <w:instrText xml:space="preserve"> PAGEREF _Toc232570752 \h </w:instrText>
         </w:r>
         <w:r>
           <w:rPr>
@@ -2628,7 +2743,7 @@
           <w:szCs w:val="22"/>
         </w:rPr>
       </w:pPr>
-      <w:hyperlink w:anchor="_Toc232399539" w:history="1">
+      <w:hyperlink w:anchor="_Toc232570753" w:history="1">
         <w:r>
           <w:rPr>
             <w:rStyle w:val="Hyperlink"/>
@@ -2655,7 +2770,7 @@
             <w:noProof/>
             <w:webHidden/>
           </w:rPr>
-          <w:instrText xml:space="preserve"> PAGEREF _Toc232399539 \h </w:instrText>
+          <w:instrText xml:space="preserve"> PAGEREF _Toc232570753 \h </w:instrText>
         </w:r>
         <w:r>
           <w:rPr>
@@ -2700,7 +2815,7 @@
           <w:szCs w:val="22"/>
         </w:rPr>
       </w:pPr>
-      <w:hyperlink w:anchor="_Toc232399540" w:history="1">
+      <w:hyperlink w:anchor="_Toc232570754" w:history="1">
         <w:r>
           <w:rPr>
             <w:rStyle w:val="Hyperlink"/>
@@ -2727,7 +2842,7 @@
             <w:noProof/>
             <w:webHidden/>
           </w:rPr>
-          <w:instrText xml:space="preserve"> PAGEREF _Toc232399540 \h </w:instrText>
+          <w:instrText xml:space="preserve"> PAGEREF _Toc232570754 \h </w:instrText>
         </w:r>
         <w:r>
           <w:rPr>
@@ -2773,7 +2888,7 @@
           <w:szCs w:val="22"/>
         </w:rPr>
       </w:pPr>
-      <w:hyperlink w:anchor="_Toc232399541" w:history="1">
+      <w:hyperlink w:anchor="_Toc232570755" w:history="1">
         <w:r>
           <w:rPr>
             <w:rStyle w:val="Hyperlink"/>
@@ -2800,7 +2915,7 @@
             <w:noProof/>
             <w:webHidden/>
           </w:rPr>
-          <w:instrText xml:space="preserve"> PAGEREF _Toc232399541 \h </w:instrText>
+          <w:instrText xml:space="preserve"> PAGEREF _Toc232570755 \h </w:instrText>
         </w:r>
         <w:r>
           <w:rPr>
@@ -2845,7 +2960,7 @@
           <w:szCs w:val="22"/>
         </w:rPr>
       </w:pPr>
-      <w:hyperlink w:anchor="_Toc232399542" w:history="1">
+      <w:hyperlink w:anchor="_Toc232570756" w:history="1">
         <w:r>
           <w:rPr>
             <w:rStyle w:val="Hyperlink"/>
@@ -2872,7 +2987,7 @@
             <w:noProof/>
             <w:webHidden/>
           </w:rPr>
-          <w:instrText xml:space="preserve"> PAGEREF _Toc232399542 \h </w:instrText>
+          <w:instrText xml:space="preserve"> PAGEREF _Toc232570756 \h </w:instrText>
         </w:r>
         <w:r>
           <w:rPr>
@@ -2917,7 +3032,7 @@
           <w:szCs w:val="22"/>
         </w:rPr>
       </w:pPr>
-      <w:hyperlink w:anchor="_Toc232399543" w:history="1">
+      <w:hyperlink w:anchor="_Toc232570757" w:history="1">
         <w:r>
           <w:rPr>
             <w:rStyle w:val="Hyperlink"/>
@@ -2944,7 +3059,7 @@
             <w:noProof/>
             <w:webHidden/>
           </w:rPr>
-          <w:instrText xml:space="preserve"> PAGEREF _Toc232399543 \h </w:instrText>
+          <w:instrText xml:space="preserve"> PAGEREF _Toc232570757 \h </w:instrText>
         </w:r>
         <w:r>
           <w:rPr>
@@ -2990,7 +3105,7 @@
           <w:szCs w:val="22"/>
         </w:rPr>
       </w:pPr>
-      <w:hyperlink w:anchor="_Toc232399544" w:history="1">
+      <w:hyperlink w:anchor="_Toc232570758" w:history="1">
         <w:r>
           <w:rPr>
             <w:rStyle w:val="Hyperlink"/>
@@ -3017,7 +3132,7 @@
             <w:noProof/>
             <w:webHidden/>
           </w:rPr>
-          <w:instrText xml:space="preserve"> PAGEREF _Toc232399544 \h </w:instrText>
+          <w:instrText xml:space="preserve"> PAGEREF _Toc232570758 \h </w:instrText>
         </w:r>
         <w:r>
           <w:rPr>
@@ -3062,7 +3177,7 @@
           <w:szCs w:val="22"/>
         </w:rPr>
       </w:pPr>
-      <w:hyperlink w:anchor="_Toc232399545" w:history="1">
+      <w:hyperlink w:anchor="_Toc232570759" w:history="1">
         <w:r>
           <w:rPr>
             <w:rStyle w:val="Hyperlink"/>
@@ -3089,7 +3204,7 @@
             <w:noProof/>
             <w:webHidden/>
           </w:rPr>
-          <w:instrText xml:space="preserve"> PAGEREF _Toc232399545 \h </w:instrText>
+          <w:instrText xml:space="preserve"> PAGEREF _Toc232570759 \h </w:instrText>
         </w:r>
         <w:r>
           <w:rPr>
@@ -3134,7 +3249,7 @@
           <w:szCs w:val="22"/>
         </w:rPr>
       </w:pPr>
-      <w:hyperlink w:anchor="_Toc232399546" w:history="1">
+      <w:hyperlink w:anchor="_Toc232570760" w:history="1">
         <w:r>
           <w:rPr>
             <w:rStyle w:val="Hyperlink"/>
@@ -3161,7 +3276,7 @@
             <w:noProof/>
             <w:webHidden/>
           </w:rPr>
-          <w:instrText xml:space="preserve"> PAGEREF _Toc232399546 \h </w:instrText>
+          <w:instrText xml:space="preserve"> PAGEREF _Toc232570760 \h </w:instrText>
         </w:r>
         <w:r>
           <w:rPr>
@@ -3206,7 +3321,7 @@
           <w:szCs w:val="22"/>
         </w:rPr>
       </w:pPr>
-      <w:hyperlink w:anchor="_Toc232399547" w:history="1">
+      <w:hyperlink w:anchor="_Toc232570761" w:history="1">
         <w:r>
           <w:rPr>
             <w:rStyle w:val="Hyperlink"/>
@@ -3233,7 +3348,7 @@
             <w:noProof/>
             <w:webHidden/>
           </w:rPr>
-          <w:instrText xml:space="preserve"> PAGEREF _Toc232399547 \h </w:instrText>
+          <w:instrText xml:space="preserve"> PAGEREF _Toc232570761 \h </w:instrText>
         </w:r>
         <w:r>
           <w:rPr>
@@ -3278,7 +3393,7 @@
           <w:szCs w:val="22"/>
         </w:rPr>
       </w:pPr>
-      <w:hyperlink w:anchor="_Toc232399548" w:history="1">
+      <w:hyperlink w:anchor="_Toc232570762" w:history="1">
         <w:r>
           <w:rPr>
             <w:rStyle w:val="Hyperlink"/>
@@ -3305,7 +3420,7 @@
             <w:noProof/>
             <w:webHidden/>
           </w:rPr>
-          <w:instrText xml:space="preserve"> PAGEREF _Toc232399548 \h </w:instrText>
+          <w:instrText xml:space="preserve"> PAGEREF _Toc232570762 \h </w:instrText>
         </w:r>
         <w:r>
           <w:rPr>
@@ -3351,7 +3466,7 @@
           <w:szCs w:val="22"/>
         </w:rPr>
       </w:pPr>
-      <w:hyperlink w:anchor="_Toc232399549" w:history="1">
+      <w:hyperlink w:anchor="_Toc232570763" w:history="1">
         <w:r>
           <w:rPr>
             <w:rStyle w:val="Hyperlink"/>
@@ -3378,7 +3493,7 @@
             <w:noProof/>
             <w:webHidden/>
           </w:rPr>
-          <w:instrText xml:space="preserve"> PAGEREF _Toc232399549 \h </w:instrText>
+          <w:instrText xml:space="preserve"> PAGEREF _Toc232570763 \h </w:instrText>
         </w:r>
         <w:r>
           <w:rPr>
@@ -3424,7 +3539,7 @@
           <w:szCs w:val="22"/>
         </w:rPr>
       </w:pPr>
-      <w:hyperlink w:anchor="_Toc232399550" w:history="1">
+      <w:hyperlink w:anchor="_Toc232570764" w:history="1">
         <w:r>
           <w:rPr>
             <w:rStyle w:val="Hyperlink"/>
@@ -3451,7 +3566,7 @@
             <w:noProof/>
             <w:webHidden/>
           </w:rPr>
-          <w:instrText xml:space="preserve"> PAGEREF _Toc232399550 \h </w:instrText>
+          <w:instrText xml:space="preserve"> PAGEREF _Toc232570764 \h </w:instrText>
         </w:r>
         <w:r>
           <w:rPr>
@@ -3497,7 +3612,7 @@
           <w:szCs w:val="22"/>
         </w:rPr>
       </w:pPr>
-      <w:hyperlink w:anchor="_Toc232399551" w:history="1">
+      <w:hyperlink w:anchor="_Toc232570765" w:history="1">
         <w:r>
           <w:rPr>
             <w:rStyle w:val="Hyperlink"/>
@@ -3524,7 +3639,7 @@
             <w:noProof/>
             <w:webHidden/>
           </w:rPr>
-          <w:instrText xml:space="preserve"> PAGEREF _Toc232399551 \h </w:instrText>
+          <w:instrText xml:space="preserve"> PAGEREF _Toc232570765 \h </w:instrText>
         </w:r>
         <w:r>
           <w:rPr>
@@ -3570,7 +3685,7 @@
           <w:szCs w:val="22"/>
         </w:rPr>
       </w:pPr>
-      <w:hyperlink w:anchor="_Toc232399552" w:history="1">
+      <w:hyperlink w:anchor="_Toc232570766" w:history="1">
         <w:r>
           <w:rPr>
             <w:rStyle w:val="Hyperlink"/>
@@ -3597,7 +3712,7 @@
             <w:noProof/>
             <w:webHidden/>
           </w:rPr>
-          <w:instrText xml:space="preserve"> PAGEREF _Toc232399552 \h </w:instrText>
+          <w:instrText xml:space="preserve"> PAGEREF _Toc232570766 \h </w:instrText>
         </w:r>
         <w:r>
           <w:rPr>
@@ -3642,7 +3757,7 @@
           <w:szCs w:val="22"/>
         </w:rPr>
       </w:pPr>
-      <w:hyperlink w:anchor="_Toc232399553" w:history="1">
+      <w:hyperlink w:anchor="_Toc232570767" w:history="1">
         <w:r>
           <w:rPr>
             <w:rStyle w:val="Hyperlink"/>
@@ -3669,7 +3784,7 @@
             <w:noProof/>
             <w:webHidden/>
           </w:rPr>
-          <w:instrText xml:space="preserve"> PAGEREF _Toc232399553 \h </w:instrText>
+          <w:instrText xml:space="preserve"> PAGEREF _Toc232570767 \h </w:instrText>
         </w:r>
         <w:r>
           <w:rPr>
@@ -3714,7 +3829,7 @@
           <w:szCs w:val="22"/>
         </w:rPr>
       </w:pPr>
-      <w:hyperlink w:anchor="_Toc232399554" w:history="1">
+      <w:hyperlink w:anchor="_Toc232570768" w:history="1">
         <w:r>
           <w:rPr>
             <w:rStyle w:val="Hyperlink"/>
@@ -3742,7 +3857,7 @@
             <w:noProof/>
             <w:webHidden/>
           </w:rPr>
-          <w:instrText xml:space="preserve"> PAGEREF _Toc232399554 \h </w:instrText>
+          <w:instrText xml:space="preserve"> PAGEREF _Toc232570768 \h </w:instrText>
         </w:r>
         <w:r>
           <w:rPr>
@@ -3788,7 +3903,7 @@
           <w:szCs w:val="22"/>
         </w:rPr>
       </w:pPr>
-      <w:hyperlink w:anchor="_Toc232399555" w:history="1">
+      <w:hyperlink w:anchor="_Toc232570769" w:history="1">
         <w:r>
           <w:rPr>
             <w:rStyle w:val="Hyperlink"/>
@@ -3816,7 +3931,7 @@
             <w:noProof/>
             <w:webHidden/>
           </w:rPr>
-          <w:instrText xml:space="preserve"> PAGEREF _Toc232399555 \h </w:instrText>
+          <w:instrText xml:space="preserve"> PAGEREF _Toc232570769 \h </w:instrText>
         </w:r>
         <w:r>
           <w:rPr>
@@ -3861,7 +3976,7 @@
           <w:szCs w:val="22"/>
         </w:rPr>
       </w:pPr>
-      <w:hyperlink w:anchor="_Toc232399556" w:history="1">
+      <w:hyperlink w:anchor="_Toc232570770" w:history="1">
         <w:r>
           <w:rPr>
             <w:rStyle w:val="Hyperlink"/>
@@ -3889,7 +4004,7 @@
             <w:noProof/>
             <w:webHidden/>
           </w:rPr>
-          <w:instrText xml:space="preserve"> PAGEREF _Toc232399556 \h </w:instrText>
+          <w:instrText xml:space="preserve"> PAGEREF _Toc232570770 \h </w:instrText>
         </w:r>
         <w:r>
           <w:rPr>
@@ -3934,7 +4049,7 @@
           <w:szCs w:val="22"/>
         </w:rPr>
       </w:pPr>
-      <w:hyperlink w:anchor="_Toc232399557" w:history="1">
+      <w:hyperlink w:anchor="_Toc232570771" w:history="1">
         <w:r>
           <w:rPr>
             <w:rStyle w:val="Hyperlink"/>
@@ -3961,7 +4076,7 @@
             <w:noProof/>
             <w:webHidden/>
           </w:rPr>
-          <w:instrText xml:space="preserve"> PAGEREF _Toc232399557 \h </w:instrText>
+          <w:instrText xml:space="preserve"> PAGEREF _Toc232570771 \h </w:instrText>
         </w:r>
         <w:r>
           <w:rPr>
@@ -4006,7 +4121,7 @@
           <w:szCs w:val="22"/>
         </w:rPr>
       </w:pPr>
-      <w:hyperlink w:anchor="_Toc232399558" w:history="1">
+      <w:hyperlink w:anchor="_Toc232570772" w:history="1">
         <w:r>
           <w:rPr>
             <w:rStyle w:val="Hyperlink"/>
@@ -4033,7 +4148,7 @@
             <w:noProof/>
             <w:webHidden/>
           </w:rPr>
-          <w:instrText xml:space="preserve"> PAGEREF _Toc232399558 \h </w:instrText>
+          <w:instrText xml:space="preserve"> PAGEREF _Toc232570772 \h </w:instrText>
         </w:r>
         <w:r>
           <w:rPr>
@@ -4079,7 +4194,7 @@
           <w:szCs w:val="22"/>
         </w:rPr>
       </w:pPr>
-      <w:hyperlink w:anchor="_Toc232399559" w:history="1">
+      <w:hyperlink w:anchor="_Toc232570773" w:history="1">
         <w:r>
           <w:rPr>
             <w:rStyle w:val="Hyperlink"/>
@@ -4106,7 +4221,7 @@
             <w:noProof/>
             <w:webHidden/>
           </w:rPr>
-          <w:instrText xml:space="preserve"> PAGEREF _Toc232399559 \h </w:instrText>
+          <w:instrText xml:space="preserve"> PAGEREF _Toc232570773 \h </w:instrText>
         </w:r>
         <w:r>
           <w:rPr>
@@ -4151,7 +4266,7 @@
           <w:szCs w:val="22"/>
         </w:rPr>
       </w:pPr>
-      <w:hyperlink w:anchor="_Toc232399560" w:history="1">
+      <w:hyperlink w:anchor="_Toc232570774" w:history="1">
         <w:r>
           <w:rPr>
             <w:rStyle w:val="Hyperlink"/>
@@ -4178,7 +4293,7 @@
             <w:noProof/>
             <w:webHidden/>
           </w:rPr>
-          <w:instrText xml:space="preserve"> PAGEREF _Toc232399560 \h </w:instrText>
+          <w:instrText xml:space="preserve"> PAGEREF _Toc232570774 \h </w:instrText>
         </w:r>
         <w:r>
           <w:rPr>
@@ -4223,7 +4338,7 @@
           <w:szCs w:val="22"/>
         </w:rPr>
       </w:pPr>
-      <w:hyperlink w:anchor="_Toc232399561" w:history="1">
+      <w:hyperlink w:anchor="_Toc232570775" w:history="1">
         <w:r>
           <w:rPr>
             <w:rStyle w:val="Hyperlink"/>
@@ -4250,7 +4365,7 @@
             <w:noProof/>
             <w:webHidden/>
           </w:rPr>
-          <w:instrText xml:space="preserve"> PAGEREF _Toc232399561 \h </w:instrText>
+          <w:instrText xml:space="preserve"> PAGEREF _Toc232570775 \h </w:instrText>
         </w:r>
         <w:r>
           <w:rPr>
@@ -4295,7 +4410,7 @@
           <w:szCs w:val="22"/>
         </w:rPr>
       </w:pPr>
-      <w:hyperlink w:anchor="_Toc232399562" w:history="1">
+      <w:hyperlink w:anchor="_Toc232570776" w:history="1">
         <w:r>
           <w:rPr>
             <w:rStyle w:val="Hyperlink"/>
@@ -4323,7 +4438,7 @@
             <w:noProof/>
             <w:webHidden/>
           </w:rPr>
-          <w:instrText xml:space="preserve"> PAGEREF _Toc232399562 \h </w:instrText>
+          <w:instrText xml:space="preserve"> PAGEREF _Toc232570776 \h </w:instrText>
         </w:r>
         <w:r>
           <w:rPr>
@@ -4368,7 +4483,7 @@
           <w:szCs w:val="22"/>
         </w:rPr>
       </w:pPr>
-      <w:hyperlink w:anchor="_Toc232399563" w:history="1">
+      <w:hyperlink w:anchor="_Toc232570777" w:history="1">
         <w:r>
           <w:rPr>
             <w:rStyle w:val="Hyperlink"/>
@@ -4396,7 +4511,7 @@
             <w:noProof/>
             <w:webHidden/>
           </w:rPr>
-          <w:instrText xml:space="preserve"> PAGEREF _Toc232399563 \h </w:instrText>
+          <w:instrText xml:space="preserve"> PAGEREF _Toc232570777 \h </w:instrText>
         </w:r>
         <w:r>
           <w:rPr>
@@ -4442,7 +4557,7 @@
           <w:szCs w:val="22"/>
         </w:rPr>
       </w:pPr>
-      <w:hyperlink w:anchor="_Toc232399564" w:history="1">
+      <w:hyperlink w:anchor="_Toc232570778" w:history="1">
         <w:r>
           <w:rPr>
             <w:rStyle w:val="Hyperlink"/>
@@ -4469,7 +4584,7 @@
             <w:noProof/>
             <w:webHidden/>
           </w:rPr>
-          <w:instrText xml:space="preserve"> PAGEREF _Toc232399564 \h </w:instrText>
+          <w:instrText xml:space="preserve"> PAGEREF _Toc232570778 \h </w:instrText>
         </w:r>
         <w:r>
           <w:rPr>
@@ -4515,7 +4630,7 @@
           <w:szCs w:val="22"/>
         </w:rPr>
       </w:pPr>
-      <w:hyperlink w:anchor="_Toc232399565" w:history="1">
+      <w:hyperlink w:anchor="_Toc232570779" w:history="1">
         <w:r>
           <w:rPr>
             <w:rStyle w:val="Hyperlink"/>
@@ -4542,7 +4657,7 @@
             <w:noProof/>
             <w:webHidden/>
           </w:rPr>
-          <w:instrText xml:space="preserve"> PAGEREF _Toc232399565 \h </w:instrText>
+          <w:instrText xml:space="preserve"> PAGEREF _Toc232570779 \h </w:instrText>
         </w:r>
         <w:r>
           <w:rPr>
@@ -4588,7 +4703,7 @@
           <w:szCs w:val="22"/>
         </w:rPr>
       </w:pPr>
-      <w:hyperlink w:anchor="_Toc232399566" w:history="1">
+      <w:hyperlink w:anchor="_Toc232570780" w:history="1">
         <w:r>
           <w:rPr>
             <w:rStyle w:val="Hyperlink"/>
@@ -4615,7 +4730,7 @@
             <w:noProof/>
             <w:webHidden/>
           </w:rPr>
-          <w:instrText xml:space="preserve"> PAGEREF _Toc232399566 \h </w:instrText>
+          <w:instrText xml:space="preserve"> PAGEREF _Toc232570780 \h </w:instrText>
         </w:r>
         <w:r>
           <w:rPr>
@@ -4660,7 +4775,7 @@
           <w:szCs w:val="22"/>
         </w:rPr>
       </w:pPr>
-      <w:hyperlink w:anchor="_Toc232399567" w:history="1">
+      <w:hyperlink w:anchor="_Toc232570781" w:history="1">
         <w:r>
           <w:rPr>
             <w:rStyle w:val="Hyperlink"/>
@@ -4687,7 +4802,7 @@
             <w:noProof/>
             <w:webHidden/>
           </w:rPr>
-          <w:instrText xml:space="preserve"> PAGEREF _Toc232399567 \h </w:instrText>
+          <w:instrText xml:space="preserve"> PAGEREF _Toc232570781 \h </w:instrText>
         </w:r>
         <w:r>
           <w:rPr>
@@ -4732,7 +4847,7 @@
           <w:szCs w:val="22"/>
         </w:rPr>
       </w:pPr>
-      <w:hyperlink w:anchor="_Toc232399568" w:history="1">
+      <w:hyperlink w:anchor="_Toc232570782" w:history="1">
         <w:r>
           <w:rPr>
             <w:rStyle w:val="Hyperlink"/>
@@ -4759,7 +4874,7 @@
             <w:noProof/>
             <w:webHidden/>
           </w:rPr>
-          <w:instrText xml:space="preserve"> PAGEREF _Toc232399568 \h </w:instrText>
+          <w:instrText xml:space="preserve"> PAGEREF _Toc232570782 \h </w:instrText>
         </w:r>
         <w:r>
           <w:rPr>
@@ -4805,7 +4920,7 @@
           <w:szCs w:val="22"/>
         </w:rPr>
       </w:pPr>
-      <w:hyperlink w:anchor="_Toc232399569" w:history="1">
+      <w:hyperlink w:anchor="_Toc232570783" w:history="1">
         <w:r>
           <w:rPr>
             <w:rStyle w:val="Hyperlink"/>
@@ -4832,7 +4947,7 @@
             <w:noProof/>
             <w:webHidden/>
           </w:rPr>
-          <w:instrText xml:space="preserve"> PAGEREF _Toc232399569 \h </w:instrText>
+          <w:instrText xml:space="preserve"> PAGEREF _Toc232570783 \h </w:instrText>
         </w:r>
         <w:r>
           <w:rPr>
@@ -4877,7 +4992,7 @@
           <w:szCs w:val="22"/>
         </w:rPr>
       </w:pPr>
-      <w:hyperlink w:anchor="_Toc232399570" w:history="1">
+      <w:hyperlink w:anchor="_Toc232570784" w:history="1">
         <w:r>
           <w:rPr>
             <w:rStyle w:val="Hyperlink"/>
@@ -4904,7 +5019,7 @@
             <w:noProof/>
             <w:webHidden/>
           </w:rPr>
-          <w:instrText xml:space="preserve"> PAGEREF _Toc232399570 \h </w:instrText>
+          <w:instrText xml:space="preserve"> PAGEREF _Toc232570784 \h </w:instrText>
         </w:r>
         <w:r>
           <w:rPr>
@@ -4949,7 +5064,7 @@
           <w:szCs w:val="22"/>
         </w:rPr>
       </w:pPr>
-      <w:hyperlink w:anchor="_Toc232399571" w:history="1">
+      <w:hyperlink w:anchor="_Toc232570785" w:history="1">
         <w:r>
           <w:rPr>
             <w:rStyle w:val="Hyperlink"/>
@@ -4976,7 +5091,7 @@
             <w:noProof/>
             <w:webHidden/>
           </w:rPr>
-          <w:instrText xml:space="preserve"> PAGEREF _Toc232399571 \h </w:instrText>
+          <w:instrText xml:space="preserve"> PAGEREF _Toc232570785 \h </w:instrText>
         </w:r>
         <w:r>
           <w:rPr>
@@ -5022,7 +5137,7 @@
           <w:szCs w:val="22"/>
         </w:rPr>
       </w:pPr>
-      <w:hyperlink w:anchor="_Toc232399572" w:history="1">
+      <w:hyperlink w:anchor="_Toc232570786" w:history="1">
         <w:r>
           <w:rPr>
             <w:rStyle w:val="Hyperlink"/>
@@ -5049,7 +5164,7 @@
             <w:noProof/>
             <w:webHidden/>
           </w:rPr>
-          <w:instrText xml:space="preserve"> PAGEREF _Toc232399572 \h </w:instrText>
+          <w:instrText xml:space="preserve"> PAGEREF _Toc232570786 \h </w:instrText>
         </w:r>
         <w:r>
           <w:rPr>
@@ -5094,7 +5209,7 @@
           <w:szCs w:val="22"/>
         </w:rPr>
       </w:pPr>
-      <w:hyperlink w:anchor="_Toc232399573" w:history="1">
+      <w:hyperlink w:anchor="_Toc232570787" w:history="1">
         <w:r>
           <w:rPr>
             <w:rStyle w:val="Hyperlink"/>
@@ -5121,7 +5236,7 @@
             <w:noProof/>
             <w:webHidden/>
           </w:rPr>
-          <w:instrText xml:space="preserve"> PAGEREF _Toc232399573 \h </w:instrText>
+          <w:instrText xml:space="preserve"> PAGEREF _Toc232570787 \h </w:instrText>
         </w:r>
         <w:r>
           <w:rPr>
@@ -5166,7 +5281,7 @@
           <w:szCs w:val="22"/>
         </w:rPr>
       </w:pPr>
-      <w:hyperlink w:anchor="_Toc232399574" w:history="1">
+      <w:hyperlink w:anchor="_Toc232570788" w:history="1">
         <w:r>
           <w:rPr>
             <w:rStyle w:val="Hyperlink"/>
@@ -5193,7 +5308,7 @@
             <w:noProof/>
             <w:webHidden/>
           </w:rPr>
-          <w:instrText xml:space="preserve"> PAGEREF _Toc232399574 \h </w:instrText>
+          <w:instrText xml:space="preserve"> PAGEREF _Toc232570788 \h </w:instrText>
         </w:r>
         <w:r>
           <w:rPr>
@@ -5238,7 +5353,7 @@
           <w:szCs w:val="22"/>
         </w:rPr>
       </w:pPr>
-      <w:hyperlink w:anchor="_Toc232399575" w:history="1">
+      <w:hyperlink w:anchor="_Toc232570789" w:history="1">
         <w:r>
           <w:rPr>
             <w:rStyle w:val="Hyperlink"/>
@@ -5265,7 +5380,7 @@
             <w:noProof/>
             <w:webHidden/>
           </w:rPr>
-          <w:instrText xml:space="preserve"> PAGEREF _Toc232399575 \h </w:instrText>
+          <w:instrText xml:space="preserve"> PAGEREF _Toc232570789 \h </w:instrText>
         </w:r>
         <w:r>
           <w:rPr>
@@ -5311,13 +5426,13 @@
           <w:szCs w:val="22"/>
         </w:rPr>
       </w:pPr>
-      <w:hyperlink w:anchor="_Toc232399576" w:history="1">
+      <w:hyperlink w:anchor="_Toc232570790" w:history="1">
         <w:r>
           <w:rPr>
             <w:rStyle w:val="Hyperlink"/>
             <w:noProof/>
           </w:rPr>
-          <w:t>5.5. Phân tích và thảo luận</w:t>
+          <w:t>5.4. Phân tích và thảo luận</w:t>
         </w:r>
         <w:r>
           <w:rPr>
@@ -5338,7 +5453,7 @@
             <w:noProof/>
             <w:webHidden/>
           </w:rPr>
-          <w:instrText xml:space="preserve"> PAGEREF _Toc232399576 \h </w:instrText>
+          <w:instrText xml:space="preserve"> PAGEREF _Toc232570790 \h </w:instrText>
         </w:r>
         <w:r>
           <w:rPr>
@@ -5383,13 +5498,13 @@
           <w:szCs w:val="22"/>
         </w:rPr>
       </w:pPr>
-      <w:hyperlink w:anchor="_Toc232399577" w:history="1">
+      <w:hyperlink w:anchor="_Toc232570791" w:history="1">
         <w:r>
           <w:rPr>
             <w:rStyle w:val="Hyperlink"/>
             <w:noProof/>
           </w:rPr>
-          <w:t>5.5.1. Điểm mạnh</w:t>
+          <w:t>5.4.1. Điểm mạnh</w:t>
         </w:r>
         <w:r>
           <w:rPr>
@@ -5410,7 +5525,7 @@
             <w:noProof/>
             <w:webHidden/>
           </w:rPr>
-          <w:instrText xml:space="preserve"> PAGEREF _Toc232399577 \h </w:instrText>
+          <w:instrText xml:space="preserve"> PAGEREF _Toc232570791 \h </w:instrText>
         </w:r>
         <w:r>
           <w:rPr>
@@ -5455,13 +5570,13 @@
           <w:szCs w:val="22"/>
         </w:rPr>
       </w:pPr>
-      <w:hyperlink w:anchor="_Toc232399578" w:history="1">
+      <w:hyperlink w:anchor="_Toc232570792" w:history="1">
         <w:r>
           <w:rPr>
             <w:rStyle w:val="Hyperlink"/>
             <w:noProof/>
           </w:rPr>
-          <w:t>5.5.2. Hạn chế và hướng cải thiện</w:t>
+          <w:t>5.4.2. Hạn chế và hướng cải thiện</w:t>
         </w:r>
         <w:r>
           <w:rPr>
@@ -5482,7 +5597,7 @@
             <w:noProof/>
             <w:webHidden/>
           </w:rPr>
-          <w:instrText xml:space="preserve"> PAGEREF _Toc232399578 \h </w:instrText>
+          <w:instrText xml:space="preserve"> PAGEREF _Toc232570792 \h </w:instrText>
         </w:r>
         <w:r>
           <w:rPr>
@@ -5528,7 +5643,7 @@
           <w:szCs w:val="22"/>
         </w:rPr>
       </w:pPr>
-      <w:hyperlink w:anchor="_Toc232399579" w:history="1">
+      <w:hyperlink w:anchor="_Toc232570793" w:history="1">
         <w:r>
           <w:rPr>
             <w:rStyle w:val="Hyperlink"/>
@@ -5555,7 +5670,7 @@
             <w:noProof/>
             <w:webHidden/>
           </w:rPr>
-          <w:instrText xml:space="preserve"> PAGEREF _Toc232399579 \h </w:instrText>
+          <w:instrText xml:space="preserve"> PAGEREF _Toc232570793 \h </w:instrText>
         </w:r>
         <w:r>
           <w:rPr>
@@ -5601,7 +5716,7 @@
           <w:szCs w:val="22"/>
         </w:rPr>
       </w:pPr>
-      <w:hyperlink w:anchor="_Toc232399580" w:history="1">
+      <w:hyperlink w:anchor="_Toc232570794" w:history="1">
         <w:r>
           <w:rPr>
             <w:rStyle w:val="Hyperlink"/>
@@ -5628,7 +5743,7 @@
             <w:noProof/>
             <w:webHidden/>
           </w:rPr>
-          <w:instrText xml:space="preserve"> PAGEREF _Toc232399580 \h </w:instrText>
+          <w:instrText xml:space="preserve"> PAGEREF _Toc232570794 \h </w:instrText>
         </w:r>
         <w:r>
           <w:rPr>
@@ -5674,7 +5789,7 @@
           <w:szCs w:val="22"/>
         </w:rPr>
       </w:pPr>
-      <w:hyperlink w:anchor="_Toc232399581" w:history="1">
+      <w:hyperlink w:anchor="_Toc232570795" w:history="1">
         <w:r>
           <w:rPr>
             <w:rStyle w:val="Hyperlink"/>
@@ -5701,7 +5816,7 @@
             <w:noProof/>
             <w:webHidden/>
           </w:rPr>
-          <w:instrText xml:space="preserve"> PAGEREF _Toc232399581 \h </w:instrText>
+          <w:instrText xml:space="preserve"> PAGEREF _Toc232570795 \h </w:instrText>
         </w:r>
         <w:r>
           <w:rPr>
@@ -5722,6 +5837,79 @@
             <w:webHidden/>
           </w:rPr>
           <w:t>30</w:t>
+        </w:r>
+        <w:r>
+          <w:rPr>
+            <w:noProof/>
+            <w:webHidden/>
+          </w:rPr>
+          <w:fldChar w:fldCharType="end"/>
+        </w:r>
+      </w:hyperlink>
+    </w:p>
+    <w:p>
+      <w:pPr>
+        <w:pStyle w:val="TOC1"/>
+        <w:tabs>
+          <w:tab w:val="right" w:leader="dot" w:pos="9062"/>
+        </w:tabs>
+        <w:rPr>
+          <w:rFonts w:asciiTheme="minorHAnsi" w:eastAsiaTheme="minorEastAsia" w:hAnsiTheme="minorHAnsi" w:cstheme="minorBidi"/>
+          <w:b w:val="0"/>
+          <w:noProof/>
+          <w:color w:val="auto"/>
+          <w:sz w:val="22"/>
+          <w:szCs w:val="22"/>
+        </w:rPr>
+      </w:pPr>
+      <w:hyperlink w:anchor="_Toc232570796" w:history="1">
+        <w:r>
+          <w:rPr>
+            <w:rStyle w:val="Hyperlink"/>
+            <w:noProof/>
+          </w:rPr>
+          <w:t>TÀI LIỆU THAM KHẢO</w:t>
+        </w:r>
+        <w:r>
+          <w:rPr>
+            <w:noProof/>
+            <w:webHidden/>
+          </w:rPr>
+          <w:tab/>
+        </w:r>
+        <w:r>
+          <w:rPr>
+            <w:noProof/>
+            <w:webHidden/>
+          </w:rPr>
+          <w:fldChar w:fldCharType="begin"/>
+        </w:r>
+        <w:r>
+          <w:rPr>
+            <w:noProof/>
+            <w:webHidden/>
+          </w:rPr>
+          <w:instrText xml:space="preserve"> PAGEREF _Toc232570796 \h </w:instrText>
+        </w:r>
+        <w:r>
+          <w:rPr>
+            <w:noProof/>
+            <w:webHidden/>
+          </w:rPr>
+        </w:r>
+        <w:r>
+          <w:rPr>
+            <w:noProof/>
+            <w:webHidden/>
+          </w:rPr>
+          <w:fldChar w:fldCharType="separate"/>
+        </w:r>
+        <w:r>
+          <w:rPr>
+            <w:noProof/>
+            <w:webHidden/>
+          </w:rPr>
+          <w:t>32</w:t>
         </w:r>
         <w:r>
           <w:rPr>
@@ -5748,6 +5936,7 @@
       </w:pPr>
       <w:r>
         <w:rPr>
+          <w:b/>
           <w:lang w:val="pt-BR"/>
         </w:rPr>
         <w:fldChar w:fldCharType="end"/>
@@ -5760,7 +5949,7 @@
           <w:lang w:val="pt-BR"/>
         </w:rPr>
       </w:pPr>
-      <w:bookmarkStart w:id="0" w:name="_Toc232399518"/>
+      <w:bookmarkStart w:id="0" w:name="_Toc232570732"/>
       <w:r>
         <w:rPr>
           <w:lang w:val="pt-BR"/>
@@ -5777,7 +5966,7 @@
         </w:tabs>
       </w:pPr>
       <w:fldSimple w:instr=" TOC \h \z \c &quot;Hình 2.&quot; ">
-        <w:hyperlink w:anchor="_Toc232399486" w:history="1">
+        <w:hyperlink w:anchor="_Toc232570376" w:history="1">
           <w:r>
             <w:rPr>
               <w:rStyle w:val="Hyperlink"/>
@@ -5804,7 +5993,7 @@
               <w:noProof/>
               <w:webHidden/>
             </w:rPr>
-            <w:instrText xml:space="preserve"> PAGEREF _Toc232399486 \h </w:instrText>
+            <w:instrText xml:space="preserve"> PAGEREF _Toc232570376 \h </w:instrText>
           </w:r>
           <w:r>
             <w:rPr>
@@ -5859,7 +6048,7 @@
       <w:r>
         <w:fldChar w:fldCharType="separate"/>
       </w:r>
-      <w:hyperlink w:anchor="_Toc232399488" w:history="1">
+      <w:hyperlink w:anchor="_Toc232570378" w:history="1">
         <w:r>
           <w:rPr>
             <w:rStyle w:val="Hyperlink"/>
@@ -5886,7 +6075,7 @@
             <w:noProof/>
             <w:webHidden/>
           </w:rPr>
-          <w:instrText xml:space="preserve"> PAGEREF _Toc232399488 \h </w:instrText>
+          <w:instrText xml:space="preserve"> PAGEREF _Toc232570378 \h </w:instrText>
         </w:r>
         <w:r>
           <w:rPr>
@@ -5931,7 +6120,7 @@
           <w:szCs w:val="22"/>
         </w:rPr>
       </w:pPr>
-      <w:hyperlink w:anchor="_Toc232399489" w:history="1">
+      <w:hyperlink w:anchor="_Toc232570379" w:history="1">
         <w:r>
           <w:rPr>
             <w:rStyle w:val="Hyperlink"/>
@@ -5958,7 +6147,7 @@
             <w:noProof/>
             <w:webHidden/>
           </w:rPr>
-          <w:instrText xml:space="preserve"> PAGEREF _Toc232399489 \h </w:instrText>
+          <w:instrText xml:space="preserve"> PAGEREF _Toc232570379 \h </w:instrText>
         </w:r>
         <w:r>
           <w:rPr>
@@ -5999,7 +6188,7 @@
           <w:noProof/>
         </w:rPr>
       </w:pPr>
-      <w:hyperlink w:anchor="_Toc232399490" w:history="1">
+      <w:hyperlink w:anchor="_Toc232570380" w:history="1">
         <w:r>
           <w:rPr>
             <w:rStyle w:val="Hyperlink"/>
@@ -6026,7 +6215,7 @@
             <w:noProof/>
             <w:webHidden/>
           </w:rPr>
-          <w:instrText xml:space="preserve"> PAGEREF _Toc232399490 \h </w:instrText>
+          <w:instrText xml:space="preserve"> PAGEREF _Toc232570380 \h </w:instrText>
         </w:r>
         <w:r>
           <w:rPr>
@@ -6083,7 +6272,7 @@
           <w:szCs w:val="22"/>
         </w:rPr>
       </w:pPr>
-      <w:hyperlink w:anchor="_Toc232399491" w:history="1">
+      <w:hyperlink w:anchor="_Toc232570381" w:history="1">
         <w:r>
           <w:rPr>
             <w:rStyle w:val="Hyperlink"/>
@@ -6110,7 +6299,7 @@
             <w:noProof/>
             <w:webHidden/>
           </w:rPr>
-          <w:instrText xml:space="preserve"> PAGEREF _Toc232399491 \h </w:instrText>
+          <w:instrText xml:space="preserve"> PAGEREF _Toc232570381 \h </w:instrText>
         </w:r>
         <w:r>
           <w:rPr>
@@ -6155,7 +6344,7 @@
           <w:szCs w:val="22"/>
         </w:rPr>
       </w:pPr>
-      <w:hyperlink w:anchor="_Toc232399492" w:history="1">
+      <w:hyperlink w:anchor="_Toc232570382" w:history="1">
         <w:r>
           <w:rPr>
             <w:rStyle w:val="Hyperlink"/>
@@ -6182,7 +6371,7 @@
             <w:noProof/>
             <w:webHidden/>
           </w:rPr>
-          <w:instrText xml:space="preserve"> PAGEREF _Toc232399492 \h </w:instrText>
+          <w:instrText xml:space="preserve"> PAGEREF _Toc232570382 \h </w:instrText>
         </w:r>
         <w:r>
           <w:rPr>
@@ -6227,7 +6416,7 @@
           <w:szCs w:val="22"/>
         </w:rPr>
       </w:pPr>
-      <w:hyperlink w:anchor="_Toc232399493" w:history="1">
+      <w:hyperlink w:anchor="_Toc232570383" w:history="1">
         <w:r>
           <w:rPr>
             <w:rStyle w:val="Hyperlink"/>
@@ -6254,7 +6443,7 @@
             <w:noProof/>
             <w:webHidden/>
           </w:rPr>
-          <w:instrText xml:space="preserve"> PAGEREF _Toc232399493 \h </w:instrText>
+          <w:instrText xml:space="preserve"> PAGEREF _Toc232570383 \h </w:instrText>
         </w:r>
         <w:r>
           <w:rPr>
@@ -6299,7 +6488,7 @@
           <w:szCs w:val="22"/>
         </w:rPr>
       </w:pPr>
-      <w:hyperlink w:anchor="_Toc232399494" w:history="1">
+      <w:hyperlink w:anchor="_Toc232570384" w:history="1">
         <w:r>
           <w:rPr>
             <w:rStyle w:val="Hyperlink"/>
@@ -6326,7 +6515,7 @@
             <w:noProof/>
             <w:webHidden/>
           </w:rPr>
-          <w:instrText xml:space="preserve"> PAGEREF _Toc232399494 \h </w:instrText>
+          <w:instrText xml:space="preserve"> PAGEREF _Toc232570384 \h </w:instrText>
         </w:r>
         <w:r>
           <w:rPr>
@@ -6371,7 +6560,7 @@
           <w:szCs w:val="22"/>
         </w:rPr>
       </w:pPr>
-      <w:hyperlink w:anchor="_Toc232399495" w:history="1">
+      <w:hyperlink w:anchor="_Toc232570385" w:history="1">
         <w:r>
           <w:rPr>
             <w:rStyle w:val="Hyperlink"/>
@@ -6398,7 +6587,7 @@
             <w:noProof/>
             <w:webHidden/>
           </w:rPr>
-          <w:instrText xml:space="preserve"> PAGEREF _Toc232399495 \h </w:instrText>
+          <w:instrText xml:space="preserve"> PAGEREF _Toc232570385 \h </w:instrText>
         </w:r>
         <w:r>
           <w:rPr>
@@ -6443,7 +6632,7 @@
           <w:szCs w:val="22"/>
         </w:rPr>
       </w:pPr>
-      <w:hyperlink w:anchor="_Toc232399496" w:history="1">
+      <w:hyperlink w:anchor="_Toc232570386" w:history="1">
         <w:r>
           <w:rPr>
             <w:rStyle w:val="Hyperlink"/>
@@ -6470,7 +6659,7 @@
             <w:noProof/>
             <w:webHidden/>
           </w:rPr>
-          <w:instrText xml:space="preserve"> PAGEREF _Toc232399496 \h </w:instrText>
+          <w:instrText xml:space="preserve"> PAGEREF _Toc232570386 \h </w:instrText>
         </w:r>
         <w:r>
           <w:rPr>
@@ -6515,7 +6704,7 @@
           <w:szCs w:val="22"/>
         </w:rPr>
       </w:pPr>
-      <w:hyperlink w:anchor="_Toc232399497" w:history="1">
+      <w:hyperlink w:anchor="_Toc232570387" w:history="1">
         <w:r>
           <w:rPr>
             <w:rStyle w:val="Hyperlink"/>
@@ -6542,7 +6731,7 @@
             <w:noProof/>
             <w:webHidden/>
           </w:rPr>
-          <w:instrText xml:space="preserve"> PAGEREF _Toc232399497 \h </w:instrText>
+          <w:instrText xml:space="preserve"> PAGEREF _Toc232570387 \h </w:instrText>
         </w:r>
         <w:r>
           <w:rPr>
@@ -6583,7 +6772,7 @@
           <w:noProof/>
         </w:rPr>
       </w:pPr>
-      <w:hyperlink w:anchor="_Toc232399498" w:history="1">
+      <w:hyperlink w:anchor="_Toc232570388" w:history="1">
         <w:r>
           <w:rPr>
             <w:rStyle w:val="Hyperlink"/>
@@ -6610,7 +6799,7 @@
             <w:noProof/>
             <w:webHidden/>
           </w:rPr>
-          <w:instrText xml:space="preserve"> PAGEREF _Toc232399498 \h </w:instrText>
+          <w:instrText xml:space="preserve"> PAGEREF _Toc232570388 \h </w:instrText>
         </w:r>
         <w:r>
           <w:rPr>
@@ -6667,13 +6856,13 @@
           <w:szCs w:val="22"/>
         </w:rPr>
       </w:pPr>
-      <w:hyperlink w:anchor="_Toc232399499" w:history="1">
+      <w:hyperlink w:anchor="_Toc232570389" w:history="1">
         <w:r>
           <w:rPr>
             <w:rStyle w:val="Hyperlink"/>
             <w:noProof/>
           </w:rPr>
-          <w:t>Hình 5. . Đường cong Training Loss và Validation Loss</w:t>
+          <w:t>Hình 5. 1. Đường cong Training Loss và Validation Loss</w:t>
         </w:r>
         <w:r>
           <w:rPr>
@@ -6694,7 +6883,7 @@
             <w:noProof/>
             <w:webHidden/>
           </w:rPr>
-          <w:instrText xml:space="preserve"> PAGEREF _Toc232399499 \h </w:instrText>
+          <w:instrText xml:space="preserve"> PAGEREF _Toc232570389 \h </w:instrText>
         </w:r>
         <w:r>
           <w:rPr>
@@ -6739,13 +6928,13 @@
           <w:szCs w:val="22"/>
         </w:rPr>
       </w:pPr>
-      <w:hyperlink w:anchor="_Toc232399500" w:history="1">
+      <w:hyperlink w:anchor="_Toc232570390" w:history="1">
         <w:r>
           <w:rPr>
             <w:rStyle w:val="Hyperlink"/>
             <w:noProof/>
           </w:rPr>
-          <w:t>Hình 5. . Ma trận nhầm lẫn tại ngưỡng tối ưu 0.73</w:t>
+          <w:t>Hình 5. 2. Ma trận nhầm lẫn tại ngưỡng tối ưu 0.73</w:t>
         </w:r>
         <w:r>
           <w:rPr>
@@ -6766,7 +6955,7 @@
             <w:noProof/>
             <w:webHidden/>
           </w:rPr>
-          <w:instrText xml:space="preserve"> PAGEREF _Toc232399500 \h </w:instrText>
+          <w:instrText xml:space="preserve"> PAGEREF _Toc232570390 \h </w:instrText>
         </w:r>
         <w:r>
           <w:rPr>
@@ -6816,7 +7005,7 @@
       <w:pPr>
         <w:pStyle w:val="P1"/>
       </w:pPr>
-      <w:bookmarkStart w:id="1" w:name="_Toc232399519"/>
+      <w:bookmarkStart w:id="1" w:name="_Toc232570733"/>
       <w:r>
         <w:t>P</w:t>
       </w:r>
@@ -6832,16 +7021,11 @@
           <w:color w:val="CCCCCC"/>
         </w:rPr>
       </w:pPr>
-      <w:bookmarkStart w:id="2" w:name="_Toc232399520"/>
-      <w:r>
-        <w:t xml:space="preserve">1.1. Lý do chọn đề </w:t>
-      </w:r>
-      <w:proofErr w:type="gramStart"/>
-      <w:r>
-        <w:t>tài</w:t>
+      <w:bookmarkStart w:id="2" w:name="_Toc232570734"/>
+      <w:r>
+        <w:t>1.1. Lý do chọn đề tài</w:t>
       </w:r>
       <w:bookmarkEnd w:id="2"/>
-      <w:proofErr w:type="gramEnd"/>
     </w:p>
     <w:p>
       <w:r>
@@ -7063,7 +7247,7 @@
       <w:pPr>
         <w:pStyle w:val="P2"/>
       </w:pPr>
-      <w:bookmarkStart w:id="3" w:name="_Toc232399521"/>
+      <w:bookmarkStart w:id="3" w:name="_Toc232570735"/>
       <w:r>
         <w:t>1.2. Mục tiêu nghiên cứu</w:t>
       </w:r>
@@ -7131,7 +7315,7 @@
       <w:pPr>
         <w:pStyle w:val="P2"/>
       </w:pPr>
-      <w:bookmarkStart w:id="4" w:name="_Toc232399522"/>
+      <w:bookmarkStart w:id="4" w:name="_Toc232570736"/>
       <w:r>
         <w:t>1.3. Đối tượng và phạm vi nghiên cứu:</w:t>
       </w:r>
@@ -7141,7 +7325,7 @@
       <w:pPr>
         <w:pStyle w:val="P3"/>
       </w:pPr>
-      <w:bookmarkStart w:id="5" w:name="_Toc232399523"/>
+      <w:bookmarkStart w:id="5" w:name="_Toc232570737"/>
       <w:r>
         <w:t>1.3.1. Đối tượng nghiên cứu</w:t>
       </w:r>
@@ -7179,7 +7363,7 @@
       <w:pPr>
         <w:pStyle w:val="P3"/>
       </w:pPr>
-      <w:bookmarkStart w:id="6" w:name="_Toc232399524"/>
+      <w:bookmarkStart w:id="6" w:name="_Toc232570738"/>
       <w:r>
         <w:t>1.3.2. Phạm vi nghiên cứu</w:t>
       </w:r>
@@ -7221,7 +7405,7 @@
       <w:pPr>
         <w:pStyle w:val="P1"/>
       </w:pPr>
-      <w:bookmarkStart w:id="7" w:name="_Toc232399525"/>
+      <w:bookmarkStart w:id="7" w:name="_Toc232570739"/>
       <w:r>
         <w:t>PHẦN 2: CƠ SỞ LÝ THUYẾT</w:t>
       </w:r>
@@ -7231,7 +7415,7 @@
       <w:pPr>
         <w:pStyle w:val="P2"/>
       </w:pPr>
-      <w:bookmarkStart w:id="8" w:name="_Toc232399526"/>
+      <w:bookmarkStart w:id="8" w:name="_Toc232570740"/>
       <w:r>
         <w:t xml:space="preserve">2.1. </w:t>
       </w:r>
@@ -7264,7 +7448,7 @@
       <w:pPr>
         <w:pStyle w:val="P3"/>
       </w:pPr>
-      <w:bookmarkStart w:id="9" w:name="_Toc232399527"/>
+      <w:bookmarkStart w:id="9" w:name="_Toc232570741"/>
       <w:r>
         <w:t>2.1.1. Kỹ thuật lọc và khử nhiễu trong miền không gian</w:t>
       </w:r>
@@ -7370,7 +7554,7 @@
           <w:color w:val="CCCCCC"/>
         </w:rPr>
       </w:pPr>
-      <w:bookmarkStart w:id="10" w:name="_Toc232399528"/>
+      <w:bookmarkStart w:id="10" w:name="_Toc232570742"/>
       <w:r>
         <w:t>2.1.</w:t>
       </w:r>
@@ -7409,7 +7593,7 @@
       <w:pPr>
         <w:pStyle w:val="P2"/>
       </w:pPr>
-      <w:bookmarkStart w:id="11" w:name="_Toc232399529"/>
+      <w:bookmarkStart w:id="11" w:name="_Toc232570743"/>
       <w:r>
         <w:t xml:space="preserve">2.2. </w:t>
       </w:r>
@@ -7425,7 +7609,7 @@
       <w:pPr>
         <w:pStyle w:val="P3"/>
       </w:pPr>
-      <w:bookmarkStart w:id="12" w:name="_Toc232399530"/>
+      <w:bookmarkStart w:id="12" w:name="_Toc232570744"/>
       <w:r>
         <w:t xml:space="preserve">2.2.1. </w:t>
       </w:r>
@@ -7569,7 +7753,7 @@
       <w:pPr>
         <w:pStyle w:val="P3"/>
       </w:pPr>
-      <w:bookmarkStart w:id="13" w:name="_Toc232399531"/>
+      <w:bookmarkStart w:id="13" w:name="_Toc232570745"/>
       <w:r>
         <w:t>2.2.2. Kiến trúc YOLOv11s-Pose</w:t>
       </w:r>
@@ -7595,7 +7779,7 @@
       <w:pPr>
         <w:pStyle w:val="P2"/>
       </w:pPr>
-      <w:bookmarkStart w:id="14" w:name="_Toc232399532"/>
+      <w:bookmarkStart w:id="14" w:name="_Toc232570746"/>
       <w:r>
         <w:t>2.3. Mạng hồi quy hai chiều PoseBiGRU-Attention</w:t>
       </w:r>
@@ -7605,7 +7789,7 @@
       <w:pPr>
         <w:pStyle w:val="P3"/>
       </w:pPr>
-      <w:bookmarkStart w:id="15" w:name="_Toc232399533"/>
+      <w:bookmarkStart w:id="15" w:name="_Toc232570747"/>
       <w:r>
         <w:t>2.3.1. Tầm quan trọng của phân tích chuỗi thời gian</w:t>
       </w:r>
@@ -7632,7 +7816,7 @@
       <w:pPr>
         <w:pStyle w:val="P3"/>
       </w:pPr>
-      <w:bookmarkStart w:id="16" w:name="_Toc232399534"/>
+      <w:bookmarkStart w:id="16" w:name="_Toc232570748"/>
       <w:r>
         <w:t xml:space="preserve">2.3.2. </w:t>
       </w:r>
@@ -7881,15 +8065,7 @@
     </w:p>
     <w:p>
       <w:r>
-        <w:t xml:space="preserve">Khối 5 - Classifier &amp; Output: Vector 768 chiều đi qua lớp Linear → LayerNorm → GELU → Dropout → Linear (256 → 2) → Softmax, cho ra xác suất 2 lớp: Fall và </w:t>
-      </w:r>
-      <w:proofErr w:type="gramStart"/>
-      <w:r>
-        <w:t>Non-Fall</w:t>
-      </w:r>
-      <w:proofErr w:type="gramEnd"/>
-      <w:r>
-        <w:t>.</w:t>
+        <w:t>Khối 5 - Classifier &amp; Output: Vector 768 chiều đi qua lớp Linear → LayerNorm → GELU → Dropout → Linear (256 → 2) → Softmax, cho ra xác suất 2 lớp: Fall và Non-Fall.</w:t>
       </w:r>
     </w:p>
     <w:p>
@@ -7954,7 +8130,7 @@
       <w:pPr>
         <w:pStyle w:val="Caption"/>
       </w:pPr>
-      <w:bookmarkStart w:id="17" w:name="_Toc232399486"/>
+      <w:bookmarkStart w:id="17" w:name="_Toc232570376"/>
       <w:r>
         <w:t xml:space="preserve">Hình 2. </w:t>
       </w:r>
@@ -7975,7 +8151,7 @@
       <w:pPr>
         <w:pStyle w:val="P2"/>
       </w:pPr>
-      <w:bookmarkStart w:id="18" w:name="_Toc232399535"/>
+      <w:bookmarkStart w:id="18" w:name="_Toc232570749"/>
       <w:r>
         <w:t>2.4. Cơ chế cửa sổ trượt</w:t>
       </w:r>
@@ -8074,7 +8250,7 @@
       <w:pPr>
         <w:pStyle w:val="P1"/>
       </w:pPr>
-      <w:bookmarkStart w:id="19" w:name="_Toc232399536"/>
+      <w:bookmarkStart w:id="19" w:name="_Toc232570750"/>
       <w:r>
         <w:t xml:space="preserve">PHẦN 3: </w:t>
       </w:r>
@@ -8090,7 +8266,7 @@
       <w:pPr>
         <w:pStyle w:val="P2"/>
       </w:pPr>
-      <w:bookmarkStart w:id="20" w:name="_Toc232399537"/>
+      <w:bookmarkStart w:id="20" w:name="_Toc232570751"/>
       <w:r>
         <w:t xml:space="preserve">3.1. </w:t>
       </w:r>
@@ -8283,7 +8459,7 @@
         <w:pStyle w:val="Caption"/>
       </w:pPr>
       <w:bookmarkStart w:id="21" w:name="_Toc231759707"/>
-      <w:bookmarkStart w:id="22" w:name="_Toc232399488"/>
+      <w:bookmarkStart w:id="22" w:name="_Toc232570378"/>
       <w:r>
         <w:t xml:space="preserve">Hình 3. </w:t>
       </w:r>
@@ -8320,7 +8496,7 @@
       <w:pPr>
         <w:pStyle w:val="P2"/>
       </w:pPr>
-      <w:bookmarkStart w:id="23" w:name="_Toc232399538"/>
+      <w:bookmarkStart w:id="23" w:name="_Toc232570752"/>
       <w:r>
         <w:t xml:space="preserve">3.2. </w:t>
       </w:r>
@@ -8333,7 +8509,7 @@
       <w:pPr>
         <w:pStyle w:val="P3"/>
       </w:pPr>
-      <w:bookmarkStart w:id="24" w:name="_Toc232399539"/>
+      <w:bookmarkStart w:id="24" w:name="_Toc232570753"/>
       <w:r>
         <w:t>3.2.1. Thiết kế module CameraManager</w:t>
       </w:r>
@@ -8480,23 +8656,7 @@
           <w:b/>
           <w:bCs/>
         </w:rPr>
-        <w:t>`</w:t>
-      </w:r>
-      <w:proofErr w:type="gramStart"/>
-      <w:r>
-        <w:rPr>
-          <w:b/>
-          <w:bCs/>
-        </w:rPr>
-        <w:t>threading.Lock</w:t>
-      </w:r>
-      <w:proofErr w:type="gramEnd"/>
-      <w:r>
-        <w:rPr>
-          <w:b/>
-          <w:bCs/>
-        </w:rPr>
-        <w:t>`</w:t>
+        <w:t>`threading.Lock`</w:t>
       </w:r>
       <w:r>
         <w:t>.</w:t>
@@ -8509,7 +8669,7 @@
           <w:color w:val="CCCCCC"/>
         </w:rPr>
       </w:pPr>
-      <w:bookmarkStart w:id="25" w:name="_Toc232399540"/>
+      <w:bookmarkStart w:id="25" w:name="_Toc232570754"/>
       <w:r>
         <w:t xml:space="preserve">3.2.2. </w:t>
       </w:r>
@@ -8763,7 +8923,7 @@
       <w:pPr>
         <w:pStyle w:val="Caption"/>
       </w:pPr>
-      <w:bookmarkStart w:id="26" w:name="_Toc232399489"/>
+      <w:bookmarkStart w:id="26" w:name="_Toc232570379"/>
       <w:r>
         <w:t xml:space="preserve">Hình 3. </w:t>
       </w:r>
@@ -8784,7 +8944,7 @@
       <w:pPr>
         <w:pStyle w:val="P2"/>
       </w:pPr>
-      <w:bookmarkStart w:id="27" w:name="_Toc232399541"/>
+      <w:bookmarkStart w:id="27" w:name="_Toc232570755"/>
       <w:r>
         <w:t xml:space="preserve">3.3. </w:t>
       </w:r>
@@ -8800,7 +8960,7 @@
           <w:color w:val="CCCCCC"/>
         </w:rPr>
       </w:pPr>
-      <w:bookmarkStart w:id="28" w:name="_Toc232399542"/>
+      <w:bookmarkStart w:id="28" w:name="_Toc232570756"/>
       <w:r>
         <w:t>3.3.1. YOLO-Pose Inference</w:t>
       </w:r>
@@ -8933,7 +9093,10 @@
               <w:pStyle w:val="Normal2"/>
             </w:pPr>
             <w:r>
-              <w:t>0.10</w:t>
+              <w:t>0.</w:t>
+            </w:r>
+            <w:r>
+              <w:t>45</w:t>
             </w:r>
           </w:p>
         </w:tc>
@@ -8946,10 +9109,10 @@
               <w:pStyle w:val="Normal2"/>
             </w:pPr>
             <w:r>
-              <w:t xml:space="preserve">Ngưỡng rất thấp </w:t>
-            </w:r>
-            <w:r>
-              <w:t>để không bỏ sót người ở tư thế nằm (box nhỏ, mờ)</w:t>
+              <w:t xml:space="preserve">Ngưỡng </w:t>
+            </w:r>
+            <w:r>
+              <w:t>vừa đủ để lọc nhiễu, tránh nhận diện nhầm các vật thể tĩnh thành người</w:t>
             </w:r>
             <w:r>
               <w:t>.</w:t>
@@ -9117,11 +9280,9 @@
             <w:pPr>
               <w:ind w:firstLine="0"/>
             </w:pPr>
-            <w:proofErr w:type="gramStart"/>
             <w:r>
               <w:t>bytetrack.yaml</w:t>
             </w:r>
-            <w:proofErr w:type="gramEnd"/>
           </w:p>
         </w:tc>
         <w:tc>
@@ -9146,7 +9307,7 @@
       <w:pPr>
         <w:pStyle w:val="P3"/>
       </w:pPr>
-      <w:bookmarkStart w:id="29" w:name="_Toc232399543"/>
+      <w:bookmarkStart w:id="29" w:name="_Toc232570757"/>
       <w:r>
         <w:t xml:space="preserve">3.3.2. </w:t>
       </w:r>
@@ -9239,7 +9400,7 @@
       <w:pPr>
         <w:pStyle w:val="P2"/>
       </w:pPr>
-      <w:bookmarkStart w:id="30" w:name="_Toc232399544"/>
+      <w:bookmarkStart w:id="30" w:name="_Toc232570758"/>
       <w:r>
         <w:t>3.4. Module phân loại hành vi té ngã</w:t>
       </w:r>
@@ -9266,7 +9427,7 @@
           <w:color w:val="CCCCCC"/>
         </w:rPr>
       </w:pPr>
-      <w:bookmarkStart w:id="31" w:name="_Toc232399545"/>
+      <w:bookmarkStart w:id="31" w:name="_Toc232570759"/>
       <w:r>
         <w:t xml:space="preserve">3.4.1. Tầng 1 </w:t>
       </w:r>
@@ -9308,13 +9469,8 @@
       <w:r>
         <w:t xml:space="preserve">2 lớp là Fall và </w:t>
       </w:r>
-      <w:proofErr w:type="gramStart"/>
-      <w:r>
-        <w:t>Non-Fall</w:t>
-      </w:r>
-      <w:proofErr w:type="gramEnd"/>
-      <w:r>
-        <w:t>.</w:t>
+      <w:r>
+        <w:t>Non-Fall.</w:t>
       </w:r>
     </w:p>
     <w:p>
@@ -9450,7 +9606,7 @@
       <w:pPr>
         <w:pStyle w:val="P3"/>
       </w:pPr>
-      <w:bookmarkStart w:id="32" w:name="_Toc232399546"/>
+      <w:bookmarkStart w:id="32" w:name="_Toc232570760"/>
       <w:r>
         <w:t xml:space="preserve">3.4.2. </w:t>
       </w:r>
@@ -10169,7 +10325,7 @@
           <w:color w:val="CCCCCC"/>
         </w:rPr>
       </w:pPr>
-      <w:bookmarkStart w:id="33" w:name="_Toc232399547"/>
+      <w:bookmarkStart w:id="33" w:name="_Toc232570761"/>
       <w:r>
         <w:t>3.4.3. Các biện pháp chống cảnh báo giả (False Positive Mitigation)</w:t>
       </w:r>
@@ -10357,7 +10513,7 @@
           <w:color w:val="CCCCCC"/>
         </w:rPr>
       </w:pPr>
-      <w:bookmarkStart w:id="34" w:name="_Toc232399548"/>
+      <w:bookmarkStart w:id="34" w:name="_Toc232570762"/>
       <w:r>
         <w:t>3.4.4. Cơ chế Debounce/Cooldown chống Spam Alert</w:t>
       </w:r>
@@ -10481,7 +10637,7 @@
       <w:pPr>
         <w:pStyle w:val="P2"/>
       </w:pPr>
-      <w:bookmarkStart w:id="35" w:name="_Toc232399549"/>
+      <w:bookmarkStart w:id="35" w:name="_Toc232570763"/>
       <w:r>
         <w:t>3.5. Module ghi log và lưu ảnh bằng chứng (Snapshot)</w:t>
       </w:r>
@@ -10522,13 +10678,8 @@
         <w:t>“</w:t>
       </w:r>
       <w:r>
-        <w:t>log_</w:t>
-      </w:r>
-      <w:proofErr w:type="gramStart"/>
-      <w:r>
-        <w:t>fall(</w:t>
-      </w:r>
-      <w:proofErr w:type="gramEnd"/>
+        <w:t>log_fall(</w:t>
+      </w:r>
       <w:r>
         <w:t>)”</w:t>
       </w:r>
@@ -10606,7 +10757,7 @@
           <w:color w:val="CCCCCC"/>
         </w:rPr>
       </w:pPr>
-      <w:bookmarkStart w:id="36" w:name="_Toc232399550"/>
+      <w:bookmarkStart w:id="36" w:name="_Toc232570764"/>
       <w:r>
         <w:t>3.6. Module cảnh báo qua Telegram</w:t>
       </w:r>
@@ -10644,13 +10795,8 @@
         <w:t>“</w:t>
       </w:r>
       <w:r>
-        <w:t>telegram_</w:t>
-      </w:r>
-      <w:proofErr w:type="gramStart"/>
-      <w:r>
-        <w:t>config.json</w:t>
-      </w:r>
-      <w:proofErr w:type="gramEnd"/>
+        <w:t>telegram_config.json</w:t>
+      </w:r>
       <w:r>
         <w:t>”</w:t>
       </w:r>
@@ -10726,7 +10872,7 @@
       <w:pPr>
         <w:pStyle w:val="Caption"/>
       </w:pPr>
-      <w:bookmarkStart w:id="37" w:name="_Toc232399490"/>
+      <w:bookmarkStart w:id="37" w:name="_Toc232570380"/>
       <w:r>
         <w:t xml:space="preserve">Hình 3. </w:t>
       </w:r>
@@ -10764,7 +10910,7 @@
       <w:pPr>
         <w:pStyle w:val="P1"/>
       </w:pPr>
-      <w:bookmarkStart w:id="38" w:name="_Toc232399551"/>
+      <w:bookmarkStart w:id="38" w:name="_Toc232570765"/>
       <w:r>
         <w:t xml:space="preserve">PHẦN 4: </w:t>
       </w:r>
@@ -10777,7 +10923,7 @@
       <w:pPr>
         <w:pStyle w:val="P2"/>
       </w:pPr>
-      <w:bookmarkStart w:id="39" w:name="_Toc232399552"/>
+      <w:bookmarkStart w:id="39" w:name="_Toc232570766"/>
       <w:r>
         <w:t>4.1. Môi trường phát triển và công nghệ sử dụng</w:t>
       </w:r>
@@ -10787,7 +10933,7 @@
       <w:pPr>
         <w:pStyle w:val="P3"/>
       </w:pPr>
-      <w:bookmarkStart w:id="40" w:name="_Toc232399553"/>
+      <w:bookmarkStart w:id="40" w:name="_Toc232570767"/>
       <w:r>
         <w:t>4.1.1. Môi trường phần cứng</w:t>
       </w:r>
@@ -11005,7 +11151,7 @@
           <w:lang w:val="en-GB"/>
         </w:rPr>
       </w:pPr>
-      <w:bookmarkStart w:id="41" w:name="_Toc232399554"/>
+      <w:bookmarkStart w:id="41" w:name="_Toc232570768"/>
       <w:r>
         <w:rPr>
           <w:lang w:val="en-GB"/>
@@ -11618,7 +11764,7 @@
           <w:lang w:val="en-GB"/>
         </w:rPr>
       </w:pPr>
-      <w:bookmarkStart w:id="42" w:name="_Toc232399555"/>
+      <w:bookmarkStart w:id="42" w:name="_Toc232570769"/>
       <w:r>
         <w:rPr>
           <w:lang w:val="en-GB"/>
@@ -11640,7 +11786,7 @@
           <w:lang w:val="en-GB"/>
         </w:rPr>
       </w:pPr>
-      <w:bookmarkStart w:id="43" w:name="_Toc232399556"/>
+      <w:bookmarkStart w:id="43" w:name="_Toc232570770"/>
       <w:r>
         <w:rPr>
           <w:lang w:val="en-GB"/>
@@ -11766,11 +11912,9 @@
       <w:r>
         <w:t>“</w:t>
       </w:r>
-      <w:proofErr w:type="gramStart"/>
       <w:r>
         <w:t>ctk.CTk</w:t>
       </w:r>
-      <w:proofErr w:type="gramEnd"/>
       <w:r>
         <w:t>”</w:t>
       </w:r>
@@ -11815,7 +11959,7 @@
       <w:pPr>
         <w:pStyle w:val="P3"/>
       </w:pPr>
-      <w:bookmarkStart w:id="44" w:name="_Toc232399557"/>
+      <w:bookmarkStart w:id="44" w:name="_Toc232570771"/>
       <w:r>
         <w:t>4.2.2. Các màn hình chính</w:t>
       </w:r>
@@ -11931,7 +12075,7 @@
       <w:pPr>
         <w:pStyle w:val="Caption"/>
       </w:pPr>
-      <w:bookmarkStart w:id="45" w:name="_Toc232399491"/>
+      <w:bookmarkStart w:id="45" w:name="_Toc232570381"/>
       <w:r>
         <w:t xml:space="preserve">Hình 4. </w:t>
       </w:r>
@@ -12071,13 +12215,8 @@
       <w:r>
         <w:t>“</w:t>
       </w:r>
-      <w:proofErr w:type="gramStart"/>
-      <w:r>
-        <w:t>Beep(</w:t>
-      </w:r>
-      <w:proofErr w:type="gramEnd"/>
-      <w:r>
-        <w:t>1000Hz, 500ms)</w:t>
+      <w:r>
+        <w:t>Beep(1000Hz, 500ms)</w:t>
       </w:r>
       <w:r>
         <w:t>”</w:t>
@@ -12156,7 +12295,7 @@
       <w:pPr>
         <w:pStyle w:val="Caption"/>
       </w:pPr>
-      <w:bookmarkStart w:id="46" w:name="_Toc232399492"/>
+      <w:bookmarkStart w:id="46" w:name="_Toc232570382"/>
       <w:r>
         <w:t xml:space="preserve">Hình 4. </w:t>
       </w:r>
@@ -12235,7 +12374,7 @@
       <w:pPr>
         <w:pStyle w:val="Caption"/>
       </w:pPr>
-      <w:bookmarkStart w:id="47" w:name="_Toc232399493"/>
+      <w:bookmarkStart w:id="47" w:name="_Toc232570383"/>
       <w:r>
         <w:t xml:space="preserve">Hình 4. </w:t>
       </w:r>
@@ -12387,7 +12526,7 @@
           <w:color w:val="CCCCCC"/>
         </w:rPr>
       </w:pPr>
-      <w:bookmarkStart w:id="48" w:name="_Toc232399494"/>
+      <w:bookmarkStart w:id="48" w:name="_Toc232570384"/>
       <w:r>
         <w:t xml:space="preserve">Hình 4. </w:t>
       </w:r>
@@ -12458,7 +12597,7 @@
       <w:pPr>
         <w:pStyle w:val="Caption"/>
       </w:pPr>
-      <w:bookmarkStart w:id="49" w:name="_Toc232399495"/>
+      <w:bookmarkStart w:id="49" w:name="_Toc232570385"/>
       <w:r>
         <w:t xml:space="preserve">Hình 4. </w:t>
       </w:r>
@@ -12498,11 +12637,9 @@
       <w:r>
         <w:t>“</w:t>
       </w:r>
-      <w:proofErr w:type="gramStart"/>
       <w:r>
         <w:t>ttk.Treeview</w:t>
       </w:r>
-      <w:proofErr w:type="gramEnd"/>
       <w:r>
         <w:t>”</w:t>
       </w:r>
@@ -12601,7 +12738,7 @@
       <w:pPr>
         <w:pStyle w:val="Caption"/>
       </w:pPr>
-      <w:bookmarkStart w:id="50" w:name="_Toc232399496"/>
+      <w:bookmarkStart w:id="50" w:name="_Toc232570386"/>
       <w:r>
         <w:t xml:space="preserve">Hình 4. </w:t>
       </w:r>
@@ -12625,7 +12762,7 @@
           <w:color w:val="CCCCCC"/>
         </w:rPr>
       </w:pPr>
-      <w:bookmarkStart w:id="51" w:name="_Toc232399558"/>
+      <w:bookmarkStart w:id="51" w:name="_Toc232570772"/>
       <w:r>
         <w:t>4.2.3. Thanh menu bên trái (Sidebar)</w:t>
       </w:r>
@@ -12701,7 +12838,7 @@
       <w:pPr>
         <w:pStyle w:val="P2"/>
       </w:pPr>
-      <w:bookmarkStart w:id="52" w:name="_Toc232399559"/>
+      <w:bookmarkStart w:id="52" w:name="_Toc232570773"/>
       <w:r>
         <w:t xml:space="preserve">4.3. Huấn </w:t>
       </w:r>
@@ -12714,7 +12851,7 @@
       <w:pPr>
         <w:pStyle w:val="P3"/>
       </w:pPr>
-      <w:bookmarkStart w:id="53" w:name="_Toc232399560"/>
+      <w:bookmarkStart w:id="53" w:name="_Toc232570774"/>
       <w:r>
         <w:t xml:space="preserve">4.3.1. </w:t>
       </w:r>
@@ -13023,7 +13160,7 @@
           <w:color w:val="CCCCCC"/>
         </w:rPr>
       </w:pPr>
-      <w:bookmarkStart w:id="54" w:name="_Toc232399561"/>
+      <w:bookmarkStart w:id="54" w:name="_Toc232570775"/>
       <w:r>
         <w:t xml:space="preserve">4.3.2. </w:t>
       </w:r>
@@ -13039,14 +13176,12 @@
       <w:r>
         <w:t xml:space="preserve">file </w:t>
       </w:r>
-      <w:proofErr w:type="gramStart"/>
       <w:r>
         <w:t>“</w:t>
       </w:r>
       <w:r>
         <w:t>.pkl</w:t>
       </w:r>
-      <w:proofErr w:type="gramEnd"/>
       <w:r>
         <w:t>”</w:t>
       </w:r>
@@ -13078,15 +13213,7 @@
         <w:t xml:space="preserve"> </w:t>
       </w:r>
       <w:r>
-        <w:t xml:space="preserve">Mỗi clip được gán nhãn FALL (1) hoặc </w:t>
-      </w:r>
-      <w:proofErr w:type="gramStart"/>
-      <w:r>
-        <w:t>NON-FALL</w:t>
-      </w:r>
-      <w:proofErr w:type="gramEnd"/>
-      <w:r>
-        <w:t xml:space="preserve"> (0).</w:t>
+        <w:t>Mỗi clip được gán nhãn FALL (1) hoặc NON-FALL (0).</w:t>
       </w:r>
     </w:p>
     <w:p>
@@ -13140,15 +13267,7 @@
         <w:t>”</w:t>
       </w:r>
       <w:r>
-        <w:t xml:space="preserve"> để bù đắp sự mất cân bằng giữa 2 lớp (clip </w:t>
-      </w:r>
-      <w:proofErr w:type="gramStart"/>
-      <w:r>
-        <w:t>Non-Fall</w:t>
-      </w:r>
-      <w:proofErr w:type="gramEnd"/>
-      <w:r>
-        <w:t xml:space="preserve"> thường nhiều hơn clip Fall).</w:t>
+        <w:t xml:space="preserve"> để bù đắp sự mất cân bằng giữa 2 lớp (clip Non-Fall thường nhiều hơn clip Fall).</w:t>
       </w:r>
     </w:p>
     <w:p>
@@ -13158,7 +13277,7 @@
           <w:lang w:val="pt-BR"/>
         </w:rPr>
       </w:pPr>
-      <w:bookmarkStart w:id="55" w:name="_Toc232399562"/>
+      <w:bookmarkStart w:id="55" w:name="_Toc232570776"/>
       <w:r>
         <w:rPr>
           <w:lang w:val="pt-BR"/>
@@ -13747,7 +13866,7 @@
           <w:lang w:val="pt-BR"/>
         </w:rPr>
       </w:pPr>
-      <w:bookmarkStart w:id="56" w:name="_Toc232399563"/>
+      <w:bookmarkStart w:id="56" w:name="_Toc232570777"/>
       <w:r>
         <w:rPr>
           <w:lang w:val="pt-BR"/>
@@ -13785,14 +13904,12 @@
       <w:r>
         <w:t>1. Upload toàn bộ dữ liệu skeleton (</w:t>
       </w:r>
-      <w:proofErr w:type="gramStart"/>
       <w:r>
         <w:t>“</w:t>
       </w:r>
       <w:r>
         <w:t>.pkl</w:t>
       </w:r>
-      <w:proofErr w:type="gramEnd"/>
       <w:r>
         <w:t>”</w:t>
       </w:r>
@@ -13900,7 +14017,7 @@
           <w:szCs w:val="24"/>
         </w:rPr>
       </w:pPr>
-      <w:bookmarkStart w:id="57" w:name="_Toc232399497"/>
+      <w:bookmarkStart w:id="57" w:name="_Toc232570387"/>
       <w:r>
         <w:t xml:space="preserve">Hình 4. </w:t>
       </w:r>
@@ -13924,7 +14041,7 @@
       <w:pPr>
         <w:pStyle w:val="P2"/>
       </w:pPr>
-      <w:bookmarkStart w:id="58" w:name="_Toc232399564"/>
+      <w:bookmarkStart w:id="58" w:name="_Toc232570778"/>
       <w:r>
         <w:t>4.4. Kết nối Camera IP từ điện t</w:t>
       </w:r>
@@ -14099,7 +14216,7 @@
       <w:pPr>
         <w:pStyle w:val="Caption"/>
       </w:pPr>
-      <w:bookmarkStart w:id="59" w:name="_Toc232399498"/>
+      <w:bookmarkStart w:id="59" w:name="_Toc232570388"/>
       <w:r>
         <w:t xml:space="preserve">Hình 4. </w:t>
       </w:r>
@@ -14136,7 +14253,7 @@
       <w:pPr>
         <w:pStyle w:val="P1"/>
       </w:pPr>
-      <w:bookmarkStart w:id="60" w:name="_Toc232399565"/>
+      <w:bookmarkStart w:id="60" w:name="_Toc232570779"/>
       <w:r>
         <w:t xml:space="preserve">PHẦN 5: </w:t>
       </w:r>
@@ -14149,7 +14266,7 @@
       <w:pPr>
         <w:pStyle w:val="P2"/>
       </w:pPr>
-      <w:bookmarkStart w:id="61" w:name="_Toc232399566"/>
+      <w:bookmarkStart w:id="61" w:name="_Toc232570780"/>
       <w:r>
         <w:t xml:space="preserve">5.1. </w:t>
       </w:r>
@@ -14165,7 +14282,7 @@
       <w:pPr>
         <w:pStyle w:val="P3"/>
       </w:pPr>
-      <w:bookmarkStart w:id="62" w:name="_Toc232399567"/>
+      <w:bookmarkStart w:id="62" w:name="_Toc232570781"/>
       <w:r>
         <w:t>5.1.1. Đánh giá năng lực phân loại</w:t>
       </w:r>
@@ -14589,7 +14706,7 @@
           <w:rFonts w:eastAsia="Times New Roman" w:cs="Times New Roman"/>
         </w:rPr>
       </w:pPr>
-      <w:bookmarkStart w:id="63" w:name="_Toc232399568"/>
+      <w:bookmarkStart w:id="63" w:name="_Toc232570782"/>
       <w:r>
         <w:t>5.1.2. Đánh giá hiệu năng hệ thống</w:t>
       </w:r>
@@ -14627,7 +14744,7 @@
         <w:pStyle w:val="P2"/>
       </w:pPr>
       <w:bookmarkStart w:id="64" w:name="_Toc232399034"/>
-      <w:bookmarkStart w:id="65" w:name="_Toc232399569"/>
+      <w:bookmarkStart w:id="65" w:name="_Toc232570783"/>
       <w:r>
         <w:t>5.2. Kịch bản thử nghiệm</w:t>
       </w:r>
@@ -14639,7 +14756,7 @@
         <w:pStyle w:val="P3"/>
       </w:pPr>
       <w:bookmarkStart w:id="66" w:name="_Toc232399035"/>
-      <w:bookmarkStart w:id="67" w:name="_Toc232399570"/>
+      <w:bookmarkStart w:id="67" w:name="_Toc232570784"/>
       <w:r>
         <w:t xml:space="preserve">5.2.1. </w:t>
       </w:r>
@@ -15347,7 +15464,7 @@
         <w:pStyle w:val="P3"/>
       </w:pPr>
       <w:bookmarkStart w:id="68" w:name="_Toc232399036"/>
-      <w:bookmarkStart w:id="69" w:name="_Toc232399571"/>
+      <w:bookmarkStart w:id="69" w:name="_Toc232570785"/>
       <w:r>
         <w:t>5.2.2. Kết quả Kịch bản Hard-Negative - Hành vi gây nhiễu</w:t>
       </w:r>
@@ -16082,7 +16199,7 @@
       <w:pPr>
         <w:pStyle w:val="P2"/>
       </w:pPr>
-      <w:bookmarkStart w:id="70" w:name="_Toc232399572"/>
+      <w:bookmarkStart w:id="70" w:name="_Toc232570786"/>
       <w:r>
         <w:t>5.3. Kết quả huấn luyện mô hình PoseBiGRU</w:t>
       </w:r>
@@ -16092,7 +16209,7 @@
       <w:pPr>
         <w:pStyle w:val="P3"/>
       </w:pPr>
-      <w:bookmarkStart w:id="71" w:name="_Toc232399573"/>
+      <w:bookmarkStart w:id="71" w:name="_Toc232570787"/>
       <w:r>
         <w:t>5.3.1. Đường cong Loss</w:t>
       </w:r>
@@ -16160,7 +16277,7 @@
       <w:pPr>
         <w:pStyle w:val="Caption"/>
       </w:pPr>
-      <w:bookmarkStart w:id="72" w:name="_Toc232399499"/>
+      <w:bookmarkStart w:id="72" w:name="_Toc232570389"/>
       <w:r>
         <w:t xml:space="preserve">Hình 5. </w:t>
       </w:r>
@@ -16173,7 +16290,10 @@
         </w:r>
       </w:fldSimple>
       <w:r>
-        <w:t>. Đường cong Training Loss và Validation Loss</w:t>
+        <w:t xml:space="preserve">. </w:t>
+      </w:r>
+      <w:r>
+        <w:t>Đường cong Training Loss và Validation Loss</w:t>
       </w:r>
       <w:bookmarkEnd w:id="72"/>
     </w:p>
@@ -16240,7 +16360,7 @@
       <w:pPr>
         <w:pStyle w:val="P3"/>
       </w:pPr>
-      <w:bookmarkStart w:id="73" w:name="_Toc232399574"/>
+      <w:bookmarkStart w:id="73" w:name="_Toc232570788"/>
       <w:r>
         <w:t xml:space="preserve">5.3.2. </w:t>
       </w:r>
@@ -16382,23 +16502,7 @@
                 <w:b/>
                 <w:bCs/>
               </w:rPr>
-              <w:t>F1-</w:t>
-            </w:r>
-            <w:proofErr w:type="gramStart"/>
-            <w:r>
-              <w:rPr>
-                <w:b/>
-                <w:bCs/>
-              </w:rPr>
-              <w:t>Score(</w:t>
-            </w:r>
-            <w:proofErr w:type="gramEnd"/>
-            <w:r>
-              <w:rPr>
-                <w:b/>
-                <w:bCs/>
-              </w:rPr>
-              <w:t>%)</w:t>
+              <w:t>F1-Score(%)</w:t>
             </w:r>
           </w:p>
         </w:tc>
@@ -16798,7 +16902,7 @@
       <w:pPr>
         <w:pStyle w:val="P3"/>
       </w:pPr>
-      <w:bookmarkStart w:id="74" w:name="_Toc232399575"/>
+      <w:bookmarkStart w:id="74" w:name="_Toc232570789"/>
       <w:r>
         <w:t xml:space="preserve">5.3.3. </w:t>
       </w:r>
@@ -16875,7 +16979,7 @@
       <w:pPr>
         <w:pStyle w:val="Caption"/>
       </w:pPr>
-      <w:bookmarkStart w:id="75" w:name="_Toc232399500"/>
+      <w:bookmarkStart w:id="75" w:name="_Toc232570390"/>
       <w:r>
         <w:t xml:space="preserve">Hình 5. </w:t>
       </w:r>
@@ -16894,10 +16998,7 @@
         <w:t>Ma trận nhầm lẫn tại ng</w:t>
       </w:r>
       <w:r>
-        <w:t xml:space="preserve">ưỡng tối ưu </w:t>
-      </w:r>
-      <w:r>
-        <w:t>0.73</w:t>
+        <w:t>ưỡng tối ưu 0.73</w:t>
       </w:r>
       <w:bookmarkEnd w:id="75"/>
     </w:p>
@@ -16937,7 +17038,7 @@
           <w:color w:val="CCCCCC"/>
         </w:rPr>
       </w:pPr>
-      <w:bookmarkStart w:id="76" w:name="_Toc232399576"/>
+      <w:bookmarkStart w:id="76" w:name="_Toc232570790"/>
       <w:r>
         <w:t>5.</w:t>
       </w:r>
@@ -16956,7 +17057,7 @@
           <w:color w:val="CCCCCC"/>
         </w:rPr>
       </w:pPr>
-      <w:bookmarkStart w:id="77" w:name="_Toc232399577"/>
+      <w:bookmarkStart w:id="77" w:name="_Toc232570791"/>
       <w:r>
         <w:t>5.</w:t>
       </w:r>
@@ -17078,7 +17179,7 @@
           <w:color w:val="CCCCCC"/>
         </w:rPr>
       </w:pPr>
-      <w:bookmarkStart w:id="78" w:name="_Toc232399578"/>
+      <w:bookmarkStart w:id="78" w:name="_Toc232570792"/>
       <w:r>
         <w:t>5.</w:t>
       </w:r>
@@ -17252,7 +17353,7 @@
       <w:pPr>
         <w:pStyle w:val="P1"/>
       </w:pPr>
-      <w:bookmarkStart w:id="79" w:name="_Toc232399579"/>
+      <w:bookmarkStart w:id="79" w:name="_Toc232570793"/>
       <w:r>
         <w:t>PHẦN 6: KẾT LUẬN VÀ HƯỚNG PHÁT TRIỂN</w:t>
       </w:r>
@@ -17265,7 +17366,7 @@
           <w:color w:val="CCCCCC"/>
         </w:rPr>
       </w:pPr>
-      <w:bookmarkStart w:id="80" w:name="_Toc232399580"/>
+      <w:bookmarkStart w:id="80" w:name="_Toc232570794"/>
       <w:r>
         <w:t>6.1. Kết luận</w:t>
       </w:r>
@@ -17429,7 +17530,7 @@
           <w:color w:val="CCCCCC"/>
         </w:rPr>
       </w:pPr>
-      <w:bookmarkStart w:id="81" w:name="_Toc232399581"/>
+      <w:bookmarkStart w:id="81" w:name="_Toc232570795"/>
       <w:r>
         <w:t>6.2. Hướng phát triển</w:t>
       </w:r>
@@ -17451,15 +17552,7 @@
     </w:p>
     <w:p>
       <w:r>
-        <w:t xml:space="preserve">2. </w:t>
-      </w:r>
-      <w:proofErr w:type="gramStart"/>
-      <w:r>
-        <w:t>Multi-camera</w:t>
-      </w:r>
-      <w:proofErr w:type="gramEnd"/>
-      <w:r>
-        <w:t xml:space="preserve"> monitoring:</w:t>
+        <w:t>2. Multi-camera monitoring:</w:t>
       </w:r>
       <w:r>
         <w:t xml:space="preserve"> Hỗ trợ đồng thời nhiều nguồn camera trên cùng một giao diện, hiển thị dạng lưới (grid), phù hợp cho viện dưỡng lão hoặc bệnh viện.</w:t>
@@ -17555,6 +17648,7 @@
         <w:br w:type="page"/>
       </w:r>
     </w:p>
+    <w:bookmarkStart w:id="82" w:name="_Toc232570796" w:displacedByCustomXml="next"/>
     <w:sdt>
       <w:sdtPr>
         <w:id w:val="-351263358"/>
@@ -17565,25 +17659,24 @@
       </w:sdtPr>
       <w:sdtEndPr>
         <w:rPr>
+          <w:b w:val="0"/>
+          <w:kern w:val="0"/>
           <w:szCs w:val="28"/>
+          <w14:ligatures w14:val="none"/>
         </w:rPr>
       </w:sdtEndPr>
       <w:sdtContent>
         <w:p>
           <w:pPr>
+            <w:pStyle w:val="P1"/>
             <w:rPr>
-              <w:rFonts w:asciiTheme="minorHAnsi" w:eastAsiaTheme="minorEastAsia" w:hAnsiTheme="minorHAnsi" w:cstheme="minorBidi"/>
-              <w:noProof/>
-              <w:color w:val="auto"/>
-              <w:kern w:val="2"/>
-              <w:sz w:val="22"/>
-              <w:szCs w:val="22"/>
-              <w14:ligatures w14:val="standardContextual"/>
+              <w:rStyle w:val="P1Char"/>
             </w:rPr>
           </w:pPr>
           <w:r>
-            <w:t>References</w:t>
+            <w:t>TÀI LIỆU THAM KHẢO</w:t>
           </w:r>
+          <w:bookmarkEnd w:id="82"/>
         </w:p>
         <w:sdt>
           <w:sdtPr>
@@ -17593,6 +17686,7 @@
           <w:sdtContent>
             <w:p>
               <w:pPr>
+                <w:ind w:firstLine="0"/>
                 <w:rPr>
                   <w:rFonts w:asciiTheme="minorHAnsi" w:eastAsiaTheme="minorEastAsia" w:hAnsiTheme="minorHAnsi" w:cstheme="minorBidi"/>
                   <w:noProof/>
@@ -17638,12 +17732,12 @@
                 <w:tblLook w:val="04A0" w:firstRow="1" w:lastRow="0" w:firstColumn="1" w:lastColumn="0" w:noHBand="0" w:noVBand="1"/>
               </w:tblPr>
               <w:tblGrid>
-                <w:gridCol w:w="402"/>
-                <w:gridCol w:w="8760"/>
+                <w:gridCol w:w="495"/>
+                <w:gridCol w:w="8667"/>
               </w:tblGrid>
               <w:tr>
                 <w:trPr>
-                  <w:divId w:val="1837720762"/>
+                  <w:divId w:val="2126189342"/>
                   <w:tblCellSpacing w:w="15" w:type="dxa"/>
                 </w:trPr>
                 <w:tc>
@@ -17665,7 +17759,20 @@
                         <w:noProof/>
                         <w:lang w:val="vi-VN"/>
                       </w:rPr>
-                      <w:t xml:space="preserve">[1] </w:t>
+                      <w:t>[</w:t>
+                    </w:r>
+                    <w:r>
+                      <w:rPr>
+                        <w:noProof/>
+                      </w:rPr>
+                      <w:t>[</w:t>
+                    </w:r>
+                    <w:r>
+                      <w:rPr>
+                        <w:noProof/>
+                        <w:lang w:val="vi-VN"/>
+                      </w:rPr>
+                      <w:t xml:space="preserve">1] </w:t>
                     </w:r>
                   </w:p>
                 </w:tc>
@@ -17694,7 +17801,7 @@
               </w:tr>
               <w:tr>
                 <w:trPr>
-                  <w:divId w:val="1837720762"/>
+                  <w:divId w:val="2126189342"/>
                   <w:tblCellSpacing w:w="15" w:type="dxa"/>
                 </w:trPr>
                 <w:tc>
@@ -17715,7 +17822,20 @@
                         <w:noProof/>
                         <w:lang w:val="vi-VN"/>
                       </w:rPr>
-                      <w:t xml:space="preserve">[2] </w:t>
+                      <w:t>[</w:t>
+                    </w:r>
+                    <w:r>
+                      <w:rPr>
+                        <w:noProof/>
+                      </w:rPr>
+                      <w:t>[</w:t>
+                    </w:r>
+                    <w:r>
+                      <w:rPr>
+                        <w:noProof/>
+                        <w:lang w:val="vi-VN"/>
+                      </w:rPr>
+                      <w:t xml:space="preserve">2] </w:t>
                     </w:r>
                   </w:p>
                 </w:tc>
@@ -17744,7 +17864,7 @@
               </w:tr>
               <w:tr>
                 <w:trPr>
-                  <w:divId w:val="1837720762"/>
+                  <w:divId w:val="2126189342"/>
                   <w:tblCellSpacing w:w="15" w:type="dxa"/>
                 </w:trPr>
                 <w:tc>
@@ -17763,7 +17883,19 @@
                       <w:rPr>
                         <w:noProof/>
                       </w:rPr>
-                      <w:t xml:space="preserve">[3] </w:t>
+                      <w:t>[</w:t>
+                    </w:r>
+                    <w:r>
+                      <w:rPr>
+                        <w:noProof/>
+                      </w:rPr>
+                      <w:t>[</w:t>
+                    </w:r>
+                    <w:r>
+                      <w:rPr>
+                        <w:noProof/>
+                      </w:rPr>
+                      <w:t xml:space="preserve">3] </w:t>
                     </w:r>
                   </w:p>
                 </w:tc>
@@ -17804,7 +17936,7 @@
               </w:tr>
               <w:tr>
                 <w:trPr>
-                  <w:divId w:val="1837720762"/>
+                  <w:divId w:val="2126189342"/>
                   <w:tblCellSpacing w:w="15" w:type="dxa"/>
                 </w:trPr>
                 <w:tc>
@@ -17823,7 +17955,19 @@
                       <w:rPr>
                         <w:noProof/>
                       </w:rPr>
-                      <w:t xml:space="preserve">[4] </w:t>
+                      <w:t>[</w:t>
+                    </w:r>
+                    <w:r>
+                      <w:rPr>
+                        <w:noProof/>
+                      </w:rPr>
+                      <w:t>[</w:t>
+                    </w:r>
+                    <w:r>
+                      <w:rPr>
+                        <w:noProof/>
+                      </w:rPr>
+                      <w:t xml:space="preserve">4] </w:t>
                     </w:r>
                   </w:p>
                 </w:tc>
@@ -17864,7 +18008,7 @@
               </w:tr>
               <w:tr>
                 <w:trPr>
-                  <w:divId w:val="1837720762"/>
+                  <w:divId w:val="2126189342"/>
                   <w:tblCellSpacing w:w="15" w:type="dxa"/>
                 </w:trPr>
                 <w:tc>
@@ -17883,7 +18027,19 @@
                       <w:rPr>
                         <w:noProof/>
                       </w:rPr>
-                      <w:t xml:space="preserve">[5] </w:t>
+                      <w:t>[</w:t>
+                    </w:r>
+                    <w:r>
+                      <w:rPr>
+                        <w:noProof/>
+                      </w:rPr>
+                      <w:t>[</w:t>
+                    </w:r>
+                    <w:r>
+                      <w:rPr>
+                        <w:noProof/>
+                      </w:rPr>
+                      <w:t xml:space="preserve">5] </w:t>
                     </w:r>
                   </w:p>
                 </w:tc>
@@ -17924,7 +18080,7 @@
               </w:tr>
               <w:tr>
                 <w:trPr>
-                  <w:divId w:val="1837720762"/>
+                  <w:divId w:val="2126189342"/>
                   <w:tblCellSpacing w:w="15" w:type="dxa"/>
                 </w:trPr>
                 <w:tc>
@@ -17943,7 +18099,19 @@
                       <w:rPr>
                         <w:noProof/>
                       </w:rPr>
-                      <w:t xml:space="preserve">[6] </w:t>
+                      <w:t>[</w:t>
+                    </w:r>
+                    <w:r>
+                      <w:rPr>
+                        <w:noProof/>
+                      </w:rPr>
+                      <w:t>[</w:t>
+                    </w:r>
+                    <w:r>
+                      <w:rPr>
+                        <w:noProof/>
+                      </w:rPr>
+                      <w:t xml:space="preserve">6] </w:t>
                     </w:r>
                   </w:p>
                 </w:tc>
@@ -17970,7 +18138,7 @@
               </w:tr>
               <w:tr>
                 <w:trPr>
-                  <w:divId w:val="1837720762"/>
+                  <w:divId w:val="2126189342"/>
                   <w:tblCellSpacing w:w="15" w:type="dxa"/>
                 </w:trPr>
                 <w:tc>
@@ -17989,7 +18157,19 @@
                       <w:rPr>
                         <w:noProof/>
                       </w:rPr>
-                      <w:t xml:space="preserve">[7] </w:t>
+                      <w:t>[</w:t>
+                    </w:r>
+                    <w:r>
+                      <w:rPr>
+                        <w:noProof/>
+                      </w:rPr>
+                      <w:t>[</w:t>
+                    </w:r>
+                    <w:r>
+                      <w:rPr>
+                        <w:noProof/>
+                      </w:rPr>
+                      <w:t xml:space="preserve">7] </w:t>
                     </w:r>
                   </w:p>
                 </w:tc>
@@ -18017,7 +18197,7 @@
             </w:tbl>
             <w:p>
               <w:pPr>
-                <w:divId w:val="1837720762"/>
+                <w:divId w:val="2126189342"/>
                 <w:rPr>
                   <w:noProof/>
                 </w:rPr>
@@ -19598,7 +19778,6 @@
   <w:style w:type="character" w:default="1" w:styleId="DefaultParagraphFont">
     <w:name w:val="Default Paragraph Font"/>
     <w:uiPriority w:val="1"/>
-    <w:semiHidden/>
     <w:unhideWhenUsed/>
   </w:style>
   <w:style w:type="table" w:default="1" w:styleId="TableNormal">

</xml_diff>